<commit_message>
Making edits to existing modules and creating new normal distribution module
</commit_message>
<xml_diff>
--- a/emiliaagostinelli/module_1/Tremblant_Worksheet.docx
+++ b/emiliaagostinelli/module_1/Tremblant_Worksheet.docx
@@ -41,25 +41,7 @@
           <w:sz w:val="24"/>
           <w:szCs w:val="24"/>
         </w:rPr>
-        <w:t xml:space="preserve">In World Cup Giant Slalom (GS), there are two runs. Only the thirty fastest racers from the first run take a second run. If a racer is disqualified (DSQ) or </w:t>
-      </w:r>
-      <w:proofErr w:type="gramStart"/>
-      <w:r>
-        <w:rPr>
-          <w:rFonts w:ascii="Calibri" w:hAnsi="Calibri" w:cs="Calibri"/>
-          <w:sz w:val="24"/>
-          <w:szCs w:val="24"/>
-        </w:rPr>
-        <w:t>did</w:t>
-      </w:r>
-      <w:proofErr w:type="gramEnd"/>
-      <w:r>
-        <w:rPr>
-          <w:rFonts w:ascii="Calibri" w:hAnsi="Calibri" w:cs="Calibri"/>
-          <w:sz w:val="24"/>
-          <w:szCs w:val="24"/>
-        </w:rPr>
-        <w:t xml:space="preserve"> not finish (DNF) their first run, they do not take a second run. The order for the first run is determined by taking all racers and ordering them by their World Cup points, from highest to lowest. From that, the top 30 racers are put into three groups. The best seven racers are randomly assigning them a bib 1-7. The next eight best competitors are randomly assigned a bib 8-15. The next best 15 racers are randomly assigned a bib 16-30. The remaining racers go in descending order of points. </w:t>
+        <w:t xml:space="preserve">In World Cup Giant Slalom (GS), there are two runs. Only the thirty fastest racers from the first run take a second run. If a racer is disqualified (DSQ) or did not finish (DNF) their first run, they do not take a second run. The order for the first run is determined by taking all racers and ordering them by their World Cup points, from highest to lowest. From that, the top 30 racers are put into three groups. The best seven racers are randomly assigning them a bib 1-7. The next eight best competitors are randomly assigned a bib 8-15. The next best 15 racers are randomly assigned a bib 16-30. The remaining racers go in descending order of points. </w:t>
       </w:r>
       <w:r>
         <w:rPr>
@@ -266,25 +248,7 @@
           <w:sz w:val="24"/>
           <w:szCs w:val="24"/>
         </w:rPr>
-        <w:t xml:space="preserve">Before we begin, brainstorm some reasons why </w:t>
-      </w:r>
-      <w:proofErr w:type="gramStart"/>
-      <w:r>
-        <w:rPr>
-          <w:rFonts w:ascii="Calibri" w:hAnsi="Calibri" w:cs="Calibri"/>
-          <w:sz w:val="24"/>
-          <w:szCs w:val="24"/>
-        </w:rPr>
-        <w:t>run</w:t>
-      </w:r>
-      <w:proofErr w:type="gramEnd"/>
-      <w:r>
-        <w:rPr>
-          <w:rFonts w:ascii="Calibri" w:hAnsi="Calibri" w:cs="Calibri"/>
-          <w:sz w:val="24"/>
-          <w:szCs w:val="24"/>
-        </w:rPr>
-        <w:t xml:space="preserve"> times may be different. (</w:t>
+        <w:t>Before we begin, brainstorm some reasons why run times may be different. (</w:t>
       </w:r>
       <w:r>
         <w:rPr>
@@ -418,25 +382,7 @@
           <w:sz w:val="24"/>
           <w:szCs w:val="24"/>
         </w:rPr>
-        <w:t xml:space="preserve">ind the </w:t>
-      </w:r>
-      <w:proofErr w:type="gramStart"/>
-      <w:r>
-        <w:rPr>
-          <w:rFonts w:ascii="Calibri" w:hAnsi="Calibri" w:cs="Calibri"/>
-          <w:sz w:val="24"/>
-          <w:szCs w:val="24"/>
-        </w:rPr>
-        <w:t>mean</w:t>
-      </w:r>
-      <w:proofErr w:type="gramEnd"/>
-      <w:r>
-        <w:rPr>
-          <w:rFonts w:ascii="Calibri" w:hAnsi="Calibri" w:cs="Calibri"/>
-          <w:sz w:val="24"/>
-          <w:szCs w:val="24"/>
-        </w:rPr>
-        <w:t xml:space="preserve"> and standard deviation of the difference between Run1_Time and Run2_Time. </w:t>
+        <w:t xml:space="preserve">ind the mean and standard deviation of the difference between Run1_Time and Run2_Time. </w:t>
       </w:r>
     </w:p>
     <w:p>
@@ -520,6 +466,22 @@
           <w:sz w:val="24"/>
           <w:szCs w:val="24"/>
         </w:rPr>
+        <w:t>1</w:t>
+      </w:r>
+      <w:r>
+        <w:rPr>
+          <w:rFonts w:ascii="Calibri" w:hAnsi="Calibri" w:cs="Calibri"/>
+          <w:sz w:val="24"/>
+          <w:szCs w:val="24"/>
+        </w:rPr>
+        <w:t>_Time is on average faster than Run</w:t>
+      </w:r>
+      <w:r>
+        <w:rPr>
+          <w:rFonts w:ascii="Calibri" w:hAnsi="Calibri" w:cs="Calibri"/>
+          <w:sz w:val="24"/>
+          <w:szCs w:val="24"/>
+        </w:rPr>
         <w:t>2</w:t>
       </w:r>
       <w:r>
@@ -528,22 +490,6 @@
           <w:sz w:val="24"/>
           <w:szCs w:val="24"/>
         </w:rPr>
-        <w:t>_Time is on average faster than Run</w:t>
-      </w:r>
-      <w:r>
-        <w:rPr>
-          <w:rFonts w:ascii="Calibri" w:hAnsi="Calibri" w:cs="Calibri"/>
-          <w:sz w:val="24"/>
-          <w:szCs w:val="24"/>
-        </w:rPr>
-        <w:t>1</w:t>
-      </w:r>
-      <w:r>
-        <w:rPr>
-          <w:rFonts w:ascii="Calibri" w:hAnsi="Calibri" w:cs="Calibri"/>
-          <w:sz w:val="24"/>
-          <w:szCs w:val="24"/>
-        </w:rPr>
         <w:t>_Time for this race, but w</w:t>
       </w:r>
       <w:r>
@@ -608,25 +554,7 @@
           <w:sz w:val="24"/>
           <w:szCs w:val="24"/>
         </w:rPr>
-        <w:t xml:space="preserve">tate hypotheses, test </w:t>
-      </w:r>
-      <w:proofErr w:type="gramStart"/>
-      <w:r>
-        <w:rPr>
-          <w:rFonts w:ascii="Calibri" w:hAnsi="Calibri" w:cs="Calibri"/>
-          <w:sz w:val="24"/>
-          <w:szCs w:val="24"/>
-        </w:rPr>
-        <w:t>statistic</w:t>
-      </w:r>
-      <w:proofErr w:type="gramEnd"/>
-      <w:r>
-        <w:rPr>
-          <w:rFonts w:ascii="Calibri" w:hAnsi="Calibri" w:cs="Calibri"/>
-          <w:sz w:val="24"/>
-          <w:szCs w:val="24"/>
-        </w:rPr>
-        <w:t>, degrees of freedom, p-value, and an informative conclusion.</w:t>
+        <w:t>tate hypotheses, test statistic, degrees of freedom, p-value, and an informative conclusion.</w:t>
       </w:r>
       <w:r>
         <w:rPr>
@@ -761,39 +689,39 @@
           <w:sz w:val="24"/>
           <w:szCs w:val="24"/>
         </w:rPr>
+        <w:t>1</w:t>
+      </w:r>
+      <w:r>
+        <w:rPr>
+          <w:rFonts w:ascii="Calibri" w:hAnsi="Calibri" w:cs="Calibri"/>
+          <w:sz w:val="24"/>
+          <w:szCs w:val="24"/>
+        </w:rPr>
+        <w:t xml:space="preserve">_Time is on average </w:t>
+      </w:r>
+      <w:r>
+        <w:rPr>
+          <w:rFonts w:ascii="Calibri" w:hAnsi="Calibri" w:cs="Calibri"/>
+          <w:sz w:val="24"/>
+          <w:szCs w:val="24"/>
+        </w:rPr>
+        <w:t xml:space="preserve">significantly </w:t>
+      </w:r>
+      <w:r>
+        <w:rPr>
+          <w:rFonts w:ascii="Calibri" w:hAnsi="Calibri" w:cs="Calibri"/>
+          <w:sz w:val="24"/>
+          <w:szCs w:val="24"/>
+        </w:rPr>
+        <w:t>faster than Run</w:t>
+      </w:r>
+      <w:r>
+        <w:rPr>
+          <w:rFonts w:ascii="Calibri" w:hAnsi="Calibri" w:cs="Calibri"/>
+          <w:sz w:val="24"/>
+          <w:szCs w:val="24"/>
+        </w:rPr>
         <w:t>2</w:t>
-      </w:r>
-      <w:r>
-        <w:rPr>
-          <w:rFonts w:ascii="Calibri" w:hAnsi="Calibri" w:cs="Calibri"/>
-          <w:sz w:val="24"/>
-          <w:szCs w:val="24"/>
-        </w:rPr>
-        <w:t xml:space="preserve">_Time is on average </w:t>
-      </w:r>
-      <w:r>
-        <w:rPr>
-          <w:rFonts w:ascii="Calibri" w:hAnsi="Calibri" w:cs="Calibri"/>
-          <w:sz w:val="24"/>
-          <w:szCs w:val="24"/>
-        </w:rPr>
-        <w:t xml:space="preserve">significantly </w:t>
-      </w:r>
-      <w:r>
-        <w:rPr>
-          <w:rFonts w:ascii="Calibri" w:hAnsi="Calibri" w:cs="Calibri"/>
-          <w:sz w:val="24"/>
-          <w:szCs w:val="24"/>
-        </w:rPr>
-        <w:t>faster than Run</w:t>
-      </w:r>
-      <w:r>
-        <w:rPr>
-          <w:rFonts w:ascii="Calibri" w:hAnsi="Calibri" w:cs="Calibri"/>
-          <w:sz w:val="24"/>
-          <w:szCs w:val="24"/>
-        </w:rPr>
-        <w:t>1</w:t>
       </w:r>
       <w:r>
         <w:rPr>

</xml_diff>

<commit_message>
Working on module 1 and data index
</commit_message>
<xml_diff>
--- a/emiliaagostinelli/module_1/Tremblant_Worksheet.docx
+++ b/emiliaagostinelli/module_1/Tremblant_Worksheet.docx
@@ -4,8 +4,15 @@
   <w:body>
     <w:p>
       <w:pPr>
-        <w:ind w:left="720" w:hanging="360"/>
         <w:jc w:val="center"/>
+        <w:rPr>
+          <w:rFonts w:ascii="Calibri" w:eastAsiaTheme="minorEastAsia" w:hAnsi="Calibri" w:cs="Calibri"/>
+          <w:color w:val="FF0000"/>
+          <w:sz w:val="24"/>
+          <w:szCs w:val="24"/>
+        </w:rPr>
+      </w:pPr>
+      <w:r>
         <w:rPr>
           <w:rFonts w:ascii="Calibri" w:hAnsi="Calibri" w:cs="Calibri"/>
           <w:b/>
@@ -14,16 +21,6 @@
           <w:sz w:val="24"/>
           <w:szCs w:val="24"/>
         </w:rPr>
-      </w:pPr>
-      <w:r>
-        <w:rPr>
-          <w:rFonts w:ascii="Calibri" w:hAnsi="Calibri" w:cs="Calibri"/>
-          <w:b/>
-          <w:bCs/>
-          <w:color w:val="808080" w:themeColor="background1" w:themeShade="80"/>
-          <w:sz w:val="24"/>
-          <w:szCs w:val="24"/>
-        </w:rPr>
         <w:t>Analyzing Difference in Run Times in Women’s World Cup GS</w:t>
       </w:r>
     </w:p>
@@ -41,7 +38,25 @@
           <w:sz w:val="24"/>
           <w:szCs w:val="24"/>
         </w:rPr>
-        <w:t xml:space="preserve">In World Cup Giant Slalom (GS), there are two runs. Only the thirty fastest racers from the first run take a second run. If a racer is disqualified (DSQ) or did not finish (DNF) their first run, they do not take a second run. The order for the first run is determined by taking all racers and ordering them by their World Cup points, from highest to lowest. From that, the top 30 racers are put into three groups. The best seven racers are randomly assigning them a bib 1-7. The next eight best competitors are randomly assigned a bib 8-15. The next best 15 racers are randomly assigned a bib 16-30. The remaining racers go in descending order of points. </w:t>
+        <w:t xml:space="preserve">In World Cup Giant Slalom (GS), there are two runs. Only the thirty fastest racers from the first run take a second run. If a racer is disqualified (DSQ) or </w:t>
+      </w:r>
+      <w:proofErr w:type="gramStart"/>
+      <w:r>
+        <w:rPr>
+          <w:rFonts w:ascii="Calibri" w:hAnsi="Calibri" w:cs="Calibri"/>
+          <w:sz w:val="24"/>
+          <w:szCs w:val="24"/>
+        </w:rPr>
+        <w:t>did</w:t>
+      </w:r>
+      <w:proofErr w:type="gramEnd"/>
+      <w:r>
+        <w:rPr>
+          <w:rFonts w:ascii="Calibri" w:hAnsi="Calibri" w:cs="Calibri"/>
+          <w:sz w:val="24"/>
+          <w:szCs w:val="24"/>
+        </w:rPr>
+        <w:t xml:space="preserve"> not finish (DNF) their first run, they do not take a second run. The order for the first run is determined by taking all racers and ordering them by their World Cup points, from highest to lowest. From that, the top 30 racers are put into three groups. The best seven racers are randomly assigning them a bib 1-7. The next eight best competitors are randomly assigned a bib 8-15. The next best 15 racers are randomly assigned a bib 16-30. The remaining racers go in descending order of points. </w:t>
       </w:r>
       <w:r>
         <w:rPr>
@@ -97,91 +112,21 @@
           <w:sz w:val="24"/>
           <w:szCs w:val="24"/>
         </w:rPr>
-        <w:t xml:space="preserve"> In this worksheet, you will be tasked with</w:t>
-      </w:r>
-      <w:r>
-        <w:rPr>
-          <w:rFonts w:ascii="Calibri" w:hAnsi="Calibri" w:cs="Calibri"/>
-          <w:sz w:val="24"/>
-          <w:szCs w:val="24"/>
-        </w:rPr>
-        <w:t xml:space="preserve"> understanding your data,</w:t>
-      </w:r>
-      <w:r>
-        <w:rPr>
-          <w:rFonts w:ascii="Calibri" w:hAnsi="Calibri" w:cs="Calibri"/>
-          <w:sz w:val="24"/>
-          <w:szCs w:val="24"/>
-        </w:rPr>
-        <w:t xml:space="preserve"> finding summary statistics, perform</w:t>
-      </w:r>
-      <w:r>
-        <w:rPr>
-          <w:rFonts w:ascii="Calibri" w:hAnsi="Calibri" w:cs="Calibri"/>
-          <w:sz w:val="24"/>
-          <w:szCs w:val="24"/>
-        </w:rPr>
-        <w:t>ing</w:t>
-      </w:r>
-      <w:r>
-        <w:rPr>
-          <w:rFonts w:ascii="Calibri" w:hAnsi="Calibri" w:cs="Calibri"/>
-          <w:sz w:val="24"/>
-          <w:szCs w:val="24"/>
-        </w:rPr>
-        <w:t xml:space="preserve"> a t-test,</w:t>
-      </w:r>
-      <w:r>
-        <w:rPr>
-          <w:rFonts w:ascii="Calibri" w:hAnsi="Calibri" w:cs="Calibri"/>
-          <w:sz w:val="24"/>
-          <w:szCs w:val="24"/>
-        </w:rPr>
-        <w:t xml:space="preserve"> constructing a confidence interval,</w:t>
-      </w:r>
-      <w:r>
-        <w:rPr>
-          <w:rFonts w:ascii="Calibri" w:hAnsi="Calibri" w:cs="Calibri"/>
-          <w:sz w:val="24"/>
-          <w:szCs w:val="24"/>
-        </w:rPr>
-        <w:t xml:space="preserve"> and interpret</w:t>
-      </w:r>
-      <w:r>
-        <w:rPr>
-          <w:rFonts w:ascii="Calibri" w:hAnsi="Calibri" w:cs="Calibri"/>
-          <w:sz w:val="24"/>
-          <w:szCs w:val="24"/>
-        </w:rPr>
-        <w:t>ing</w:t>
-      </w:r>
-      <w:r>
-        <w:rPr>
-          <w:rFonts w:ascii="Calibri" w:hAnsi="Calibri" w:cs="Calibri"/>
-          <w:sz w:val="24"/>
-          <w:szCs w:val="24"/>
-        </w:rPr>
-        <w:t xml:space="preserve"> your findings</w:t>
-      </w:r>
-      <w:r>
-        <w:rPr>
-          <w:rFonts w:ascii="Calibri" w:hAnsi="Calibri" w:cs="Calibri"/>
-          <w:sz w:val="24"/>
-          <w:szCs w:val="24"/>
-        </w:rPr>
-        <w:t xml:space="preserve"> in the context of this setting</w:t>
-      </w:r>
-      <w:r>
-        <w:rPr>
-          <w:rFonts w:ascii="Calibri" w:hAnsi="Calibri" w:cs="Calibri"/>
-          <w:sz w:val="24"/>
-          <w:szCs w:val="24"/>
-        </w:rPr>
-        <w:t>.</w:t>
-      </w:r>
-    </w:p>
-    <w:p>
-      <w:pPr>
+        <w:t xml:space="preserve"> In this worksheet, you will be tasked with understanding your data, finding summary statistics, performing a t-test, constructing a confidence interval, and interpreting your findings in the context of this setting. The data is stored in Tremblant_diff.csv.</w:t>
+      </w:r>
+    </w:p>
+    <w:p>
+      <w:pPr>
+        <w:rPr>
+          <w:rFonts w:ascii="Calibri" w:hAnsi="Calibri" w:cs="Calibri"/>
+          <w:sz w:val="24"/>
+          <w:szCs w:val="24"/>
+        </w:rPr>
+      </w:pPr>
+    </w:p>
+    <w:p>
+      <w:pPr>
+        <w:pStyle w:val="ListParagraph"/>
         <w:rPr>
           <w:rFonts w:ascii="Calibri" w:hAnsi="Calibri" w:cs="Calibri"/>
           <w:sz w:val="24"/>
@@ -194,7 +139,7 @@
         <w:pStyle w:val="ListParagraph"/>
         <w:numPr>
           <w:ilvl w:val="0"/>
-          <w:numId w:val="1"/>
+          <w:numId w:val="2"/>
         </w:numPr>
         <w:rPr>
           <w:rFonts w:ascii="Calibri" w:hAnsi="Calibri" w:cs="Calibri"/>
@@ -208,14 +153,82 @@
           <w:sz w:val="24"/>
           <w:szCs w:val="24"/>
         </w:rPr>
-        <w:t>Read in Tremblant1.csv.</w:t>
-      </w:r>
-    </w:p>
-    <w:p>
-      <w:pPr>
-        <w:pStyle w:val="ListParagraph"/>
-        <w:rPr>
-          <w:rFonts w:ascii="Calibri" w:hAnsi="Calibri" w:cs="Calibri"/>
+        <w:t xml:space="preserve">In this module, we want to explore how times may differ between runs. Before we begin, brainstorm some reasons why </w:t>
+      </w:r>
+      <w:proofErr w:type="gramStart"/>
+      <w:r>
+        <w:rPr>
+          <w:rFonts w:ascii="Calibri" w:hAnsi="Calibri" w:cs="Calibri"/>
+          <w:sz w:val="24"/>
+          <w:szCs w:val="24"/>
+        </w:rPr>
+        <w:t>run</w:t>
+      </w:r>
+      <w:proofErr w:type="gramEnd"/>
+      <w:r>
+        <w:rPr>
+          <w:rFonts w:ascii="Calibri" w:hAnsi="Calibri" w:cs="Calibri"/>
+          <w:sz w:val="24"/>
+          <w:szCs w:val="24"/>
+        </w:rPr>
+        <w:t xml:space="preserve"> times may be different. (As a reminder, the course is reset between runs.)</w:t>
+      </w:r>
+    </w:p>
+    <w:p>
+      <w:pPr>
+        <w:rPr>
+          <w:rFonts w:ascii="Calibri" w:hAnsi="Calibri" w:cs="Calibri"/>
+          <w:color w:val="EE0000"/>
+          <w:sz w:val="24"/>
+          <w:szCs w:val="24"/>
+        </w:rPr>
+      </w:pPr>
+    </w:p>
+    <w:p>
+      <w:pPr>
+        <w:rPr>
+          <w:rFonts w:ascii="Calibri" w:hAnsi="Calibri" w:cs="Calibri"/>
+          <w:color w:val="EE0000"/>
+          <w:sz w:val="24"/>
+          <w:szCs w:val="24"/>
+        </w:rPr>
+      </w:pPr>
+    </w:p>
+    <w:p>
+      <w:pPr>
+        <w:rPr>
+          <w:rFonts w:ascii="Calibri" w:hAnsi="Calibri" w:cs="Calibri"/>
+          <w:color w:val="EE0000"/>
+          <w:sz w:val="24"/>
+          <w:szCs w:val="24"/>
+        </w:rPr>
+      </w:pPr>
+    </w:p>
+    <w:p>
+      <w:pPr>
+        <w:rPr>
+          <w:rFonts w:ascii="Calibri" w:hAnsi="Calibri" w:cs="Calibri"/>
+          <w:color w:val="EE0000"/>
+          <w:sz w:val="24"/>
+          <w:szCs w:val="24"/>
+        </w:rPr>
+      </w:pPr>
+    </w:p>
+    <w:p>
+      <w:pPr>
+        <w:rPr>
+          <w:rFonts w:ascii="Calibri" w:hAnsi="Calibri" w:cs="Calibri"/>
+          <w:color w:val="EE0000"/>
+          <w:sz w:val="24"/>
+          <w:szCs w:val="24"/>
+        </w:rPr>
+      </w:pPr>
+    </w:p>
+    <w:p>
+      <w:pPr>
+        <w:rPr>
+          <w:rFonts w:ascii="Calibri" w:hAnsi="Calibri" w:cs="Calibri"/>
+          <w:color w:val="EE0000"/>
           <w:sz w:val="24"/>
           <w:szCs w:val="24"/>
         </w:rPr>
@@ -226,7 +239,7 @@
         <w:pStyle w:val="ListParagraph"/>
         <w:numPr>
           <w:ilvl w:val="0"/>
-          <w:numId w:val="1"/>
+          <w:numId w:val="2"/>
         </w:numPr>
         <w:rPr>
           <w:rFonts w:ascii="Calibri" w:hAnsi="Calibri" w:cs="Calibri"/>
@@ -240,74 +253,71 @@
           <w:sz w:val="24"/>
           <w:szCs w:val="24"/>
         </w:rPr>
-        <w:t xml:space="preserve">In this module, we want to explore how times may differ between runs. </w:t>
-      </w:r>
-      <w:r>
-        <w:rPr>
-          <w:rFonts w:ascii="Calibri" w:hAnsi="Calibri" w:cs="Calibri"/>
-          <w:sz w:val="24"/>
-          <w:szCs w:val="24"/>
-        </w:rPr>
-        <w:t>Before we begin, brainstorm some reasons why run times may be different. (</w:t>
-      </w:r>
-      <w:r>
-        <w:rPr>
-          <w:rFonts w:ascii="Calibri" w:hAnsi="Calibri" w:cs="Calibri"/>
-          <w:sz w:val="24"/>
-          <w:szCs w:val="24"/>
-        </w:rPr>
-        <w:t>As a reminder</w:t>
-      </w:r>
-      <w:r>
-        <w:rPr>
-          <w:rFonts w:ascii="Calibri" w:hAnsi="Calibri" w:cs="Calibri"/>
-          <w:sz w:val="24"/>
-          <w:szCs w:val="24"/>
-        </w:rPr>
-        <w:t>, the course is reset between runs.)</w:t>
-      </w:r>
-    </w:p>
-    <w:p>
-      <w:pPr>
-        <w:pStyle w:val="ListParagraph"/>
-        <w:rPr>
-          <w:rFonts w:ascii="Calibri" w:hAnsi="Calibri" w:cs="Calibri"/>
-          <w:sz w:val="24"/>
-          <w:szCs w:val="24"/>
-        </w:rPr>
-      </w:pPr>
-    </w:p>
-    <w:p>
-      <w:pPr>
-        <w:rPr>
-          <w:rFonts w:ascii="Calibri" w:hAnsi="Calibri" w:cs="Calibri"/>
-          <w:sz w:val="24"/>
-          <w:szCs w:val="24"/>
-        </w:rPr>
-      </w:pPr>
-    </w:p>
-    <w:p>
-      <w:pPr>
-        <w:rPr>
-          <w:rFonts w:ascii="Calibri" w:hAnsi="Calibri" w:cs="Calibri"/>
-          <w:sz w:val="24"/>
-          <w:szCs w:val="24"/>
-        </w:rPr>
-      </w:pPr>
-    </w:p>
-    <w:p>
-      <w:pPr>
-        <w:pStyle w:val="ListParagraph"/>
-        <w:rPr>
-          <w:rFonts w:ascii="Calibri" w:hAnsi="Calibri" w:cs="Calibri"/>
-          <w:sz w:val="24"/>
-          <w:szCs w:val="24"/>
-        </w:rPr>
-      </w:pPr>
-    </w:p>
-    <w:p>
-      <w:pPr>
-        <w:pStyle w:val="ListParagraph"/>
+        <w:t>It is good practice to gain a better understanding of our data before performing analysis. It may be helpful to know the average difference in time for the two runs, as well as have an idea of the spread of our data. To do this, let’s f</w:t>
+      </w:r>
+      <w:r>
+        <w:rPr>
+          <w:rFonts w:ascii="Calibri" w:hAnsi="Calibri" w:cs="Calibri"/>
+          <w:sz w:val="24"/>
+          <w:szCs w:val="24"/>
+        </w:rPr>
+        <w:t xml:space="preserve">ind the mean and standard deviation of the difference </w:t>
+      </w:r>
+      <w:r>
+        <w:rPr>
+          <w:rFonts w:ascii="Calibri" w:hAnsi="Calibri" w:cs="Calibri"/>
+          <w:sz w:val="24"/>
+          <w:szCs w:val="24"/>
+        </w:rPr>
+        <w:t xml:space="preserve">of </w:t>
+      </w:r>
+      <w:proofErr w:type="spellStart"/>
+      <w:r>
+        <w:rPr>
+          <w:rFonts w:ascii="Calibri" w:hAnsi="Calibri" w:cs="Calibri"/>
+          <w:sz w:val="24"/>
+          <w:szCs w:val="24"/>
+        </w:rPr>
+        <w:t>Time_Diff</w:t>
+      </w:r>
+      <w:proofErr w:type="spellEnd"/>
+      <w:r>
+        <w:rPr>
+          <w:rFonts w:ascii="Calibri" w:hAnsi="Calibri" w:cs="Calibri"/>
+          <w:sz w:val="24"/>
+          <w:szCs w:val="24"/>
+        </w:rPr>
+        <w:t xml:space="preserve"> (a variable representing Run1_Time minus Run2_Time)</w:t>
+      </w:r>
+      <w:r>
+        <w:rPr>
+          <w:rFonts w:ascii="Calibri" w:hAnsi="Calibri" w:cs="Calibri"/>
+          <w:sz w:val="24"/>
+          <w:szCs w:val="24"/>
+        </w:rPr>
+        <w:t xml:space="preserve">. </w:t>
+      </w:r>
+    </w:p>
+    <w:p>
+      <w:pPr>
+        <w:rPr>
+          <w:rFonts w:ascii="Calibri" w:hAnsi="Calibri" w:cs="Calibri"/>
+          <w:sz w:val="24"/>
+          <w:szCs w:val="24"/>
+        </w:rPr>
+      </w:pPr>
+    </w:p>
+    <w:p>
+      <w:pPr>
+        <w:rPr>
+          <w:rFonts w:ascii="Calibri" w:hAnsi="Calibri" w:cs="Calibri"/>
+          <w:sz w:val="24"/>
+          <w:szCs w:val="24"/>
+        </w:rPr>
+      </w:pPr>
+    </w:p>
+    <w:p>
+      <w:pPr>
         <w:rPr>
           <w:rFonts w:ascii="Calibri" w:hAnsi="Calibri" w:cs="Calibri"/>
           <w:sz w:val="24"/>
@@ -320,7 +330,7 @@
         <w:pStyle w:val="ListParagraph"/>
         <w:numPr>
           <w:ilvl w:val="0"/>
-          <w:numId w:val="1"/>
+          <w:numId w:val="2"/>
         </w:numPr>
         <w:rPr>
           <w:rFonts w:ascii="Calibri" w:hAnsi="Calibri" w:cs="Calibri"/>
@@ -334,56 +344,109 @@
           <w:sz w:val="24"/>
           <w:szCs w:val="24"/>
         </w:rPr>
-        <w:t>I</w:t>
-      </w:r>
-      <w:r>
-        <w:rPr>
-          <w:rFonts w:ascii="Calibri" w:hAnsi="Calibri" w:cs="Calibri"/>
-          <w:sz w:val="24"/>
-          <w:szCs w:val="24"/>
-        </w:rPr>
-        <w:t xml:space="preserve">t is </w:t>
-      </w:r>
-      <w:r>
-        <w:rPr>
-          <w:rFonts w:ascii="Calibri" w:hAnsi="Calibri" w:cs="Calibri"/>
-          <w:sz w:val="24"/>
-          <w:szCs w:val="24"/>
-        </w:rPr>
-        <w:t>good practice</w:t>
-      </w:r>
-      <w:r>
-        <w:rPr>
-          <w:rFonts w:ascii="Calibri" w:hAnsi="Calibri" w:cs="Calibri"/>
-          <w:sz w:val="24"/>
-          <w:szCs w:val="24"/>
-        </w:rPr>
-        <w:t xml:space="preserve"> to gain a better understanding of our data</w:t>
-      </w:r>
-      <w:r>
-        <w:rPr>
-          <w:rFonts w:ascii="Calibri" w:hAnsi="Calibri" w:cs="Calibri"/>
-          <w:sz w:val="24"/>
-          <w:szCs w:val="24"/>
-        </w:rPr>
-        <w:t xml:space="preserve"> before performing analysis</w:t>
-      </w:r>
-      <w:r>
-        <w:rPr>
-          <w:rFonts w:ascii="Calibri" w:hAnsi="Calibri" w:cs="Calibri"/>
-          <w:sz w:val="24"/>
-          <w:szCs w:val="24"/>
-        </w:rPr>
-        <w:t>. It may be helpful to know the average difference in time for the two runs, as well as have an idea of the spread of our data. To do this, let’s f</w:t>
-      </w:r>
-      <w:r>
-        <w:rPr>
-          <w:rFonts w:ascii="Calibri" w:hAnsi="Calibri" w:cs="Calibri"/>
-          <w:sz w:val="24"/>
-          <w:szCs w:val="24"/>
-        </w:rPr>
-        <w:t xml:space="preserve">ind the mean and standard deviation of the difference between Run1_Time and Run2_Time. </w:t>
-      </w:r>
+        <w:lastRenderedPageBreak/>
+        <w:t>Above, we saw that Run1_Time is on average faster than Run2_Time for this race, but we can p</w:t>
+      </w:r>
+      <w:r>
+        <w:rPr>
+          <w:rFonts w:ascii="Calibri" w:hAnsi="Calibri" w:cs="Calibri"/>
+          <w:sz w:val="24"/>
+          <w:szCs w:val="24"/>
+        </w:rPr>
+        <w:t xml:space="preserve">erform a </w:t>
+      </w:r>
+      <w:r>
+        <w:rPr>
+          <w:rFonts w:ascii="Calibri" w:hAnsi="Calibri" w:cs="Calibri"/>
+          <w:sz w:val="24"/>
+          <w:szCs w:val="24"/>
+        </w:rPr>
+        <w:t xml:space="preserve">hypothesis </w:t>
+      </w:r>
+      <w:r>
+        <w:rPr>
+          <w:rFonts w:ascii="Calibri" w:hAnsi="Calibri" w:cs="Calibri"/>
+          <w:sz w:val="24"/>
+          <w:szCs w:val="24"/>
+        </w:rPr>
+        <w:t>test for difference in means</w:t>
+      </w:r>
+      <w:r>
+        <w:rPr>
+          <w:rFonts w:ascii="Calibri" w:hAnsi="Calibri" w:cs="Calibri"/>
+          <w:sz w:val="24"/>
+          <w:szCs w:val="24"/>
+        </w:rPr>
+        <w:t xml:space="preserve"> to see whether it is significantly faster</w:t>
+      </w:r>
+      <w:r>
+        <w:rPr>
+          <w:rFonts w:ascii="Calibri" w:hAnsi="Calibri" w:cs="Calibri"/>
+          <w:sz w:val="24"/>
+          <w:szCs w:val="24"/>
+        </w:rPr>
+        <w:t xml:space="preserve">. </w:t>
+      </w:r>
+      <w:r>
+        <w:rPr>
+          <w:rFonts w:ascii="Calibri" w:hAnsi="Calibri" w:cs="Calibri"/>
+          <w:sz w:val="24"/>
+          <w:szCs w:val="24"/>
+        </w:rPr>
+        <w:t>Perform this test and s</w:t>
+      </w:r>
+      <w:r>
+        <w:rPr>
+          <w:rFonts w:ascii="Calibri" w:hAnsi="Calibri" w:cs="Calibri"/>
+          <w:sz w:val="24"/>
+          <w:szCs w:val="24"/>
+        </w:rPr>
+        <w:t xml:space="preserve">tate hypotheses, test </w:t>
+      </w:r>
+      <w:proofErr w:type="gramStart"/>
+      <w:r>
+        <w:rPr>
+          <w:rFonts w:ascii="Calibri" w:hAnsi="Calibri" w:cs="Calibri"/>
+          <w:sz w:val="24"/>
+          <w:szCs w:val="24"/>
+        </w:rPr>
+        <w:t>statistic</w:t>
+      </w:r>
+      <w:proofErr w:type="gramEnd"/>
+      <w:r>
+        <w:rPr>
+          <w:rFonts w:ascii="Calibri" w:hAnsi="Calibri" w:cs="Calibri"/>
+          <w:sz w:val="24"/>
+          <w:szCs w:val="24"/>
+        </w:rPr>
+        <w:t>, degrees of freedom, p-value, and an informative conclusion.</w:t>
+      </w:r>
+      <w:r>
+        <w:rPr>
+          <w:rFonts w:ascii="Calibri" w:hAnsi="Calibri" w:cs="Calibri"/>
+          <w:sz w:val="24"/>
+          <w:szCs w:val="24"/>
+        </w:rPr>
+        <w:t xml:space="preserve"> </w:t>
+      </w:r>
+    </w:p>
+    <w:p>
+      <w:pPr>
+        <w:rPr>
+          <w:rFonts w:ascii="Calibri" w:hAnsi="Calibri" w:cs="Calibri"/>
+          <w:sz w:val="24"/>
+          <w:szCs w:val="24"/>
+        </w:rPr>
+      </w:pPr>
+    </w:p>
+    <w:p>
+      <w:pPr>
+        <w:rPr>
+          <w:rFonts w:ascii="Calibri" w:hAnsi="Calibri" w:cs="Calibri"/>
+          <w:sz w:val="24"/>
+          <w:szCs w:val="24"/>
+        </w:rPr>
+      </w:pPr>
     </w:p>
     <w:p>
       <w:pPr>
@@ -435,7 +498,7 @@
         <w:pStyle w:val="ListParagraph"/>
         <w:numPr>
           <w:ilvl w:val="0"/>
-          <w:numId w:val="1"/>
+          <w:numId w:val="2"/>
         </w:numPr>
         <w:rPr>
           <w:rFonts w:ascii="Calibri" w:hAnsi="Calibri" w:cs="Calibri"/>
@@ -449,135 +512,36 @@
           <w:sz w:val="24"/>
           <w:szCs w:val="24"/>
         </w:rPr>
-        <w:lastRenderedPageBreak/>
-        <w:t xml:space="preserve">Above, we saw that </w:t>
-      </w:r>
-      <w:r>
-        <w:rPr>
-          <w:rFonts w:ascii="Calibri" w:hAnsi="Calibri" w:cs="Calibri"/>
-          <w:sz w:val="24"/>
-          <w:szCs w:val="24"/>
-        </w:rPr>
-        <w:t>Run</w:t>
-      </w:r>
-      <w:r>
-        <w:rPr>
-          <w:rFonts w:ascii="Calibri" w:hAnsi="Calibri" w:cs="Calibri"/>
-          <w:sz w:val="24"/>
-          <w:szCs w:val="24"/>
-        </w:rPr>
-        <w:t>1</w:t>
-      </w:r>
-      <w:r>
-        <w:rPr>
-          <w:rFonts w:ascii="Calibri" w:hAnsi="Calibri" w:cs="Calibri"/>
-          <w:sz w:val="24"/>
-          <w:szCs w:val="24"/>
-        </w:rPr>
-        <w:t>_Time is on average faster than Run</w:t>
-      </w:r>
-      <w:r>
-        <w:rPr>
-          <w:rFonts w:ascii="Calibri" w:hAnsi="Calibri" w:cs="Calibri"/>
-          <w:sz w:val="24"/>
-          <w:szCs w:val="24"/>
-        </w:rPr>
-        <w:t>2</w:t>
-      </w:r>
-      <w:r>
-        <w:rPr>
-          <w:rFonts w:ascii="Calibri" w:hAnsi="Calibri" w:cs="Calibri"/>
-          <w:sz w:val="24"/>
-          <w:szCs w:val="24"/>
-        </w:rPr>
-        <w:t>_Time for this race, but w</w:t>
-      </w:r>
-      <w:r>
-        <w:rPr>
-          <w:rFonts w:ascii="Calibri" w:hAnsi="Calibri" w:cs="Calibri"/>
-          <w:sz w:val="24"/>
-          <w:szCs w:val="24"/>
-        </w:rPr>
-        <w:t>e can p</w:t>
-      </w:r>
-      <w:r>
-        <w:rPr>
-          <w:rFonts w:ascii="Calibri" w:hAnsi="Calibri" w:cs="Calibri"/>
-          <w:sz w:val="24"/>
-          <w:szCs w:val="24"/>
-        </w:rPr>
-        <w:t xml:space="preserve">erform a </w:t>
-      </w:r>
-      <w:r>
-        <w:rPr>
-          <w:rFonts w:ascii="Calibri" w:hAnsi="Calibri" w:cs="Calibri"/>
-          <w:sz w:val="24"/>
-          <w:szCs w:val="24"/>
-        </w:rPr>
-        <w:t xml:space="preserve">hypothesis </w:t>
-      </w:r>
-      <w:r>
-        <w:rPr>
-          <w:rFonts w:ascii="Calibri" w:hAnsi="Calibri" w:cs="Calibri"/>
-          <w:sz w:val="24"/>
-          <w:szCs w:val="24"/>
-        </w:rPr>
-        <w:t>test for difference in means</w:t>
-      </w:r>
-      <w:r>
-        <w:rPr>
-          <w:rFonts w:ascii="Calibri" w:hAnsi="Calibri" w:cs="Calibri"/>
-          <w:sz w:val="24"/>
-          <w:szCs w:val="24"/>
-        </w:rPr>
-        <w:t xml:space="preserve"> to see whether it is significantly faster</w:t>
-      </w:r>
-      <w:r>
-        <w:rPr>
-          <w:rFonts w:ascii="Calibri" w:hAnsi="Calibri" w:cs="Calibri"/>
-          <w:sz w:val="24"/>
-          <w:szCs w:val="24"/>
-        </w:rPr>
-        <w:t xml:space="preserve">. </w:t>
-      </w:r>
-      <w:r>
-        <w:rPr>
-          <w:rFonts w:ascii="Calibri" w:hAnsi="Calibri" w:cs="Calibri"/>
-          <w:sz w:val="24"/>
-          <w:szCs w:val="24"/>
-        </w:rPr>
-        <w:t>Perform this test and s</w:t>
-      </w:r>
-      <w:r>
-        <w:rPr>
-          <w:rFonts w:ascii="Calibri" w:hAnsi="Calibri" w:cs="Calibri"/>
-          <w:sz w:val="24"/>
-          <w:szCs w:val="24"/>
-        </w:rPr>
-        <w:t>tate hypotheses, test statistic, degrees of freedom, p-value, and an informative conclusion.</w:t>
-      </w:r>
-      <w:r>
-        <w:rPr>
-          <w:rFonts w:ascii="Calibri" w:hAnsi="Calibri" w:cs="Calibri"/>
-          <w:sz w:val="24"/>
-          <w:szCs w:val="24"/>
-        </w:rPr>
-        <w:t xml:space="preserve"> </w:t>
-      </w:r>
-    </w:p>
-    <w:p>
-      <w:pPr>
-        <w:ind w:left="360"/>
-        <w:rPr>
-          <w:rFonts w:ascii="Calibri" w:hAnsi="Calibri" w:cs="Calibri"/>
-          <w:sz w:val="24"/>
-          <w:szCs w:val="24"/>
-        </w:rPr>
-      </w:pPr>
-    </w:p>
-    <w:p>
-      <w:pPr>
-        <w:ind w:left="360"/>
+        <w:t xml:space="preserve">From the results of the hypothesis test, we observe that Run1_Time is on average significantly faster than Run2_Time. Suppose that this data is a sample from a wider population of elite racers. We may want to understand the range of values that the true run time difference can take on for the entire population, not just this sample. </w:t>
+      </w:r>
+      <w:r>
+        <w:rPr>
+          <w:rFonts w:ascii="Calibri" w:hAnsi="Calibri" w:cs="Calibri"/>
+          <w:sz w:val="24"/>
+          <w:szCs w:val="24"/>
+        </w:rPr>
+        <w:t>Find a 95% CI for difference in mean run times</w:t>
+      </w:r>
+      <w:r>
+        <w:rPr>
+          <w:rFonts w:ascii="Calibri" w:hAnsi="Calibri" w:cs="Calibri"/>
+          <w:sz w:val="24"/>
+          <w:szCs w:val="24"/>
+        </w:rPr>
+        <w:t xml:space="preserve"> and give an interpretation of this interval. As a reminder, we are comparing the time to complete the runs. (If computing by hand, use n = 27 as three racers DNF on Run 2).</w:t>
+      </w:r>
+    </w:p>
+    <w:p>
+      <w:pPr>
+        <w:rPr>
+          <w:rFonts w:ascii="Calibri" w:hAnsi="Calibri" w:cs="Calibri"/>
+          <w:sz w:val="24"/>
+          <w:szCs w:val="24"/>
+        </w:rPr>
+      </w:pPr>
+    </w:p>
+    <w:p>
+      <w:pPr>
         <w:rPr>
           <w:rFonts w:ascii="Calibri" w:hAnsi="Calibri" w:cs="Calibri"/>
           <w:sz w:val="24"/>
@@ -635,7 +599,7 @@
         <w:pStyle w:val="ListParagraph"/>
         <w:numPr>
           <w:ilvl w:val="0"/>
-          <w:numId w:val="1"/>
+          <w:numId w:val="2"/>
         </w:numPr>
         <w:rPr>
           <w:rFonts w:ascii="Calibri" w:hAnsi="Calibri" w:cs="Calibri"/>
@@ -649,252 +613,73 @@
           <w:sz w:val="24"/>
           <w:szCs w:val="24"/>
         </w:rPr>
-        <w:t xml:space="preserve">From the results </w:t>
-      </w:r>
-      <w:r>
-        <w:rPr>
-          <w:rFonts w:ascii="Calibri" w:hAnsi="Calibri" w:cs="Calibri"/>
-          <w:sz w:val="24"/>
-          <w:szCs w:val="24"/>
-        </w:rPr>
-        <w:t>of the hypothesis test</w:t>
-      </w:r>
-      <w:r>
-        <w:rPr>
-          <w:rFonts w:ascii="Calibri" w:hAnsi="Calibri" w:cs="Calibri"/>
-          <w:sz w:val="24"/>
-          <w:szCs w:val="24"/>
-        </w:rPr>
-        <w:t xml:space="preserve">, we </w:t>
-      </w:r>
-      <w:r>
-        <w:rPr>
-          <w:rFonts w:ascii="Calibri" w:hAnsi="Calibri" w:cs="Calibri"/>
-          <w:sz w:val="24"/>
-          <w:szCs w:val="24"/>
-        </w:rPr>
-        <w:t>observe</w:t>
-      </w:r>
-      <w:r>
-        <w:rPr>
-          <w:rFonts w:ascii="Calibri" w:hAnsi="Calibri" w:cs="Calibri"/>
-          <w:sz w:val="24"/>
-          <w:szCs w:val="24"/>
-        </w:rPr>
-        <w:t xml:space="preserve"> that Run</w:t>
-      </w:r>
-      <w:r>
-        <w:rPr>
-          <w:rFonts w:ascii="Calibri" w:hAnsi="Calibri" w:cs="Calibri"/>
-          <w:sz w:val="24"/>
-          <w:szCs w:val="24"/>
-        </w:rPr>
-        <w:t>1</w:t>
-      </w:r>
-      <w:r>
-        <w:rPr>
-          <w:rFonts w:ascii="Calibri" w:hAnsi="Calibri" w:cs="Calibri"/>
-          <w:sz w:val="24"/>
-          <w:szCs w:val="24"/>
-        </w:rPr>
-        <w:t xml:space="preserve">_Time is on average </w:t>
-      </w:r>
-      <w:r>
-        <w:rPr>
-          <w:rFonts w:ascii="Calibri" w:hAnsi="Calibri" w:cs="Calibri"/>
-          <w:sz w:val="24"/>
-          <w:szCs w:val="24"/>
-        </w:rPr>
-        <w:t xml:space="preserve">significantly </w:t>
-      </w:r>
-      <w:r>
-        <w:rPr>
-          <w:rFonts w:ascii="Calibri" w:hAnsi="Calibri" w:cs="Calibri"/>
-          <w:sz w:val="24"/>
-          <w:szCs w:val="24"/>
-        </w:rPr>
-        <w:t>faster than Run</w:t>
-      </w:r>
-      <w:r>
-        <w:rPr>
-          <w:rFonts w:ascii="Calibri" w:hAnsi="Calibri" w:cs="Calibri"/>
-          <w:sz w:val="24"/>
-          <w:szCs w:val="24"/>
-        </w:rPr>
-        <w:t>2</w:t>
-      </w:r>
-      <w:r>
-        <w:rPr>
-          <w:rFonts w:ascii="Calibri" w:hAnsi="Calibri" w:cs="Calibri"/>
-          <w:sz w:val="24"/>
-          <w:szCs w:val="24"/>
-        </w:rPr>
-        <w:t>_Time</w:t>
-      </w:r>
-      <w:r>
-        <w:rPr>
-          <w:rFonts w:ascii="Calibri" w:hAnsi="Calibri" w:cs="Calibri"/>
-          <w:sz w:val="24"/>
-          <w:szCs w:val="24"/>
-        </w:rPr>
-        <w:t>. While w</w:t>
-      </w:r>
-      <w:r>
-        <w:rPr>
-          <w:rFonts w:ascii="Calibri" w:hAnsi="Calibri" w:cs="Calibri"/>
-          <w:sz w:val="24"/>
-          <w:szCs w:val="24"/>
-        </w:rPr>
-        <w:t>e</w:t>
-      </w:r>
-      <w:r>
-        <w:rPr>
-          <w:rFonts w:ascii="Calibri" w:hAnsi="Calibri" w:cs="Calibri"/>
-          <w:sz w:val="24"/>
-          <w:szCs w:val="24"/>
-        </w:rPr>
-        <w:t xml:space="preserve"> have come to this conclusion, we may</w:t>
-      </w:r>
-      <w:r>
-        <w:rPr>
-          <w:rFonts w:ascii="Calibri" w:hAnsi="Calibri" w:cs="Calibri"/>
-          <w:sz w:val="24"/>
-          <w:szCs w:val="24"/>
-        </w:rPr>
-        <w:t xml:space="preserve"> want to understand the range of values that the true run time difference can take on</w:t>
-      </w:r>
-      <w:r>
-        <w:rPr>
-          <w:rFonts w:ascii="Calibri" w:hAnsi="Calibri" w:cs="Calibri"/>
-          <w:sz w:val="24"/>
-          <w:szCs w:val="24"/>
-        </w:rPr>
-        <w:t xml:space="preserve"> for the entire population</w:t>
-      </w:r>
-      <w:r>
-        <w:rPr>
-          <w:rFonts w:ascii="Calibri" w:hAnsi="Calibri" w:cs="Calibri"/>
-          <w:sz w:val="24"/>
-          <w:szCs w:val="24"/>
-        </w:rPr>
-        <w:t xml:space="preserve"> of racers, not just this sample</w:t>
-      </w:r>
-      <w:r>
-        <w:rPr>
-          <w:rFonts w:ascii="Calibri" w:hAnsi="Calibri" w:cs="Calibri"/>
-          <w:sz w:val="24"/>
-          <w:szCs w:val="24"/>
-        </w:rPr>
-        <w:t xml:space="preserve">. </w:t>
-      </w:r>
-      <w:r>
-        <w:rPr>
-          <w:rFonts w:ascii="Calibri" w:hAnsi="Calibri" w:cs="Calibri"/>
-          <w:sz w:val="24"/>
-          <w:szCs w:val="24"/>
-        </w:rPr>
-        <w:t>Find a 95% CI for difference in mean run times</w:t>
-      </w:r>
-      <w:r>
-        <w:rPr>
-          <w:rFonts w:ascii="Calibri" w:hAnsi="Calibri" w:cs="Calibri"/>
-          <w:sz w:val="24"/>
-          <w:szCs w:val="24"/>
-        </w:rPr>
-        <w:t xml:space="preserve"> and give an interpretation of this interval.</w:t>
-      </w:r>
-      <w:r>
-        <w:rPr>
-          <w:rFonts w:ascii="Calibri" w:hAnsi="Calibri" w:cs="Calibri"/>
-          <w:sz w:val="24"/>
-          <w:szCs w:val="24"/>
-        </w:rPr>
-        <w:t xml:space="preserve"> (If computing by hand, use n = 27 as three racers DNF </w:t>
-      </w:r>
-      <w:r>
-        <w:rPr>
-          <w:rFonts w:ascii="Calibri" w:hAnsi="Calibri" w:cs="Calibri"/>
-          <w:sz w:val="24"/>
-          <w:szCs w:val="24"/>
-        </w:rPr>
-        <w:t xml:space="preserve">on </w:t>
-      </w:r>
-      <w:r>
-        <w:rPr>
-          <w:rFonts w:ascii="Calibri" w:hAnsi="Calibri" w:cs="Calibri"/>
-          <w:sz w:val="24"/>
-          <w:szCs w:val="24"/>
-        </w:rPr>
-        <w:t>Run 2).</w:t>
-      </w:r>
-    </w:p>
-    <w:p>
-      <w:pPr>
-        <w:rPr>
-          <w:rFonts w:ascii="Calibri" w:hAnsi="Calibri" w:cs="Calibri"/>
-          <w:sz w:val="24"/>
-          <w:szCs w:val="24"/>
-        </w:rPr>
-      </w:pPr>
-    </w:p>
-    <w:p>
-      <w:pPr>
-        <w:rPr>
-          <w:rFonts w:ascii="Calibri" w:hAnsi="Calibri" w:cs="Calibri"/>
-          <w:sz w:val="24"/>
-          <w:szCs w:val="24"/>
-        </w:rPr>
-      </w:pPr>
-    </w:p>
-    <w:p>
-      <w:pPr>
-        <w:rPr>
-          <w:rFonts w:ascii="Calibri" w:hAnsi="Calibri" w:cs="Calibri"/>
-          <w:sz w:val="24"/>
-          <w:szCs w:val="24"/>
-        </w:rPr>
-      </w:pPr>
-    </w:p>
-    <w:p>
-      <w:pPr>
-        <w:rPr>
-          <w:rFonts w:ascii="Calibri" w:hAnsi="Calibri" w:cs="Calibri"/>
-          <w:sz w:val="24"/>
-          <w:szCs w:val="24"/>
-        </w:rPr>
-      </w:pPr>
-    </w:p>
-    <w:p>
-      <w:pPr>
-        <w:rPr>
-          <w:rFonts w:ascii="Calibri" w:hAnsi="Calibri" w:cs="Calibri"/>
-          <w:sz w:val="24"/>
-          <w:szCs w:val="24"/>
-        </w:rPr>
-      </w:pPr>
-    </w:p>
-    <w:p>
-      <w:pPr>
-        <w:rPr>
-          <w:rFonts w:ascii="Calibri" w:hAnsi="Calibri" w:cs="Calibri"/>
-          <w:sz w:val="24"/>
-          <w:szCs w:val="24"/>
-        </w:rPr>
-      </w:pPr>
-    </w:p>
-    <w:p>
-      <w:pPr>
-        <w:rPr>
-          <w:rFonts w:ascii="Calibri" w:hAnsi="Calibri" w:cs="Calibri"/>
-          <w:sz w:val="24"/>
-          <w:szCs w:val="24"/>
-        </w:rPr>
-      </w:pPr>
-    </w:p>
-    <w:p>
-      <w:pPr>
-        <w:rPr>
-          <w:rFonts w:ascii="Calibri" w:hAnsi="Calibri" w:cs="Calibri"/>
+        <w:t xml:space="preserve">How do your findings in questions </w:t>
+      </w:r>
+      <w:r>
+        <w:rPr>
+          <w:rFonts w:ascii="Calibri" w:hAnsi="Calibri" w:cs="Calibri"/>
+          <w:sz w:val="24"/>
+          <w:szCs w:val="24"/>
+        </w:rPr>
+        <w:t>3</w:t>
+      </w:r>
+      <w:r>
+        <w:rPr>
+          <w:rFonts w:ascii="Calibri" w:hAnsi="Calibri" w:cs="Calibri"/>
+          <w:sz w:val="24"/>
+          <w:szCs w:val="24"/>
+        </w:rPr>
+        <w:t xml:space="preserve"> and </w:t>
+      </w:r>
+      <w:r>
+        <w:rPr>
+          <w:rFonts w:ascii="Calibri" w:hAnsi="Calibri" w:cs="Calibri"/>
+          <w:sz w:val="24"/>
+          <w:szCs w:val="24"/>
+        </w:rPr>
+        <w:t>4</w:t>
+      </w:r>
+      <w:r>
+        <w:rPr>
+          <w:rFonts w:ascii="Calibri" w:hAnsi="Calibri" w:cs="Calibri"/>
+          <w:sz w:val="24"/>
+          <w:szCs w:val="24"/>
+        </w:rPr>
+        <w:t xml:space="preserve"> relate?</w:t>
+      </w:r>
+      <w:r>
+        <w:rPr>
+          <w:rFonts w:ascii="Calibri" w:hAnsi="Calibri" w:cs="Calibri"/>
+          <w:sz w:val="24"/>
+          <w:szCs w:val="24"/>
+        </w:rPr>
+        <w:t xml:space="preserve"> What could your findings reveal about the differences between the courses on the first and second runs?</w:t>
+      </w:r>
+    </w:p>
+    <w:p>
+      <w:pPr>
+        <w:rPr>
+          <w:rFonts w:ascii="Calibri" w:hAnsi="Calibri" w:cs="Calibri"/>
+          <w:sz w:val="24"/>
+          <w:szCs w:val="24"/>
+        </w:rPr>
+      </w:pPr>
+    </w:p>
+    <w:p>
+      <w:pPr>
+        <w:rPr>
+          <w:rFonts w:ascii="Calibri" w:eastAsiaTheme="minorEastAsia" w:hAnsi="Calibri" w:cs="Calibri"/>
+          <w:color w:val="FF0000"/>
+          <w:sz w:val="24"/>
+          <w:szCs w:val="24"/>
+        </w:rPr>
+      </w:pPr>
+    </w:p>
+    <w:p>
+      <w:pPr>
+        <w:rPr>
+          <w:rFonts w:ascii="Calibri" w:eastAsiaTheme="minorEastAsia" w:hAnsi="Calibri" w:cs="Calibri"/>
+          <w:color w:val="FF0000"/>
           <w:sz w:val="24"/>
           <w:szCs w:val="24"/>
         </w:rPr>
@@ -905,62 +690,346 @@
         <w:pStyle w:val="ListParagraph"/>
         <w:numPr>
           <w:ilvl w:val="0"/>
-          <w:numId w:val="1"/>
+          <w:numId w:val="2"/>
         </w:numPr>
         <w:rPr>
-          <w:rFonts w:ascii="Calibri" w:hAnsi="Calibri" w:cs="Calibri"/>
-          <w:sz w:val="24"/>
-          <w:szCs w:val="24"/>
-        </w:rPr>
-      </w:pPr>
-      <w:r>
-        <w:rPr>
-          <w:rFonts w:ascii="Calibri" w:hAnsi="Calibri" w:cs="Calibri"/>
-          <w:sz w:val="24"/>
-          <w:szCs w:val="24"/>
-        </w:rPr>
-        <w:t xml:space="preserve">How do your findings in questions </w:t>
-      </w:r>
-      <w:r>
-        <w:rPr>
-          <w:rFonts w:ascii="Calibri" w:hAnsi="Calibri" w:cs="Calibri"/>
-          <w:sz w:val="24"/>
-          <w:szCs w:val="24"/>
-        </w:rPr>
-        <w:t>3</w:t>
-      </w:r>
-      <w:r>
-        <w:rPr>
-          <w:rFonts w:ascii="Calibri" w:hAnsi="Calibri" w:cs="Calibri"/>
-          <w:sz w:val="24"/>
-          <w:szCs w:val="24"/>
-        </w:rPr>
-        <w:t xml:space="preserve"> and </w:t>
-      </w:r>
-      <w:r>
-        <w:rPr>
-          <w:rFonts w:ascii="Calibri" w:hAnsi="Calibri" w:cs="Calibri"/>
-          <w:sz w:val="24"/>
-          <w:szCs w:val="24"/>
-        </w:rPr>
-        <w:t>4</w:t>
-      </w:r>
-      <w:r>
-        <w:rPr>
-          <w:rFonts w:ascii="Calibri" w:hAnsi="Calibri" w:cs="Calibri"/>
-          <w:sz w:val="24"/>
-          <w:szCs w:val="24"/>
-        </w:rPr>
-        <w:t xml:space="preserve"> relate?</w:t>
-      </w:r>
-      <w:r>
-        <w:rPr>
-          <w:rFonts w:ascii="Calibri" w:hAnsi="Calibri" w:cs="Calibri"/>
-          <w:sz w:val="24"/>
-          <w:szCs w:val="24"/>
-        </w:rPr>
-        <w:t xml:space="preserve"> What could your findings reveal about the differences between the courses on the first and second runs?</w:t>
-      </w:r>
+          <w:rFonts w:ascii="Calibri" w:eastAsiaTheme="minorEastAsia" w:hAnsi="Calibri" w:cs="Calibri"/>
+          <w:sz w:val="24"/>
+          <w:szCs w:val="24"/>
+        </w:rPr>
+      </w:pPr>
+      <w:r>
+        <w:rPr>
+          <w:rFonts w:ascii="Calibri" w:eastAsiaTheme="minorEastAsia" w:hAnsi="Calibri" w:cs="Calibri"/>
+          <w:sz w:val="24"/>
+          <w:szCs w:val="24"/>
+        </w:rPr>
+        <w:lastRenderedPageBreak/>
+        <w:t>Now, let’s compare our findings to another women’s world cup giant slalom race at Copper Mountain. Below are the results from a test for difference in mean run times.  Interpret the results from the test and the 95% CI. What does this reveal about the differences between courses on the first and second run?</w:t>
+      </w:r>
+    </w:p>
+    <w:p>
+      <w:pPr>
+        <w:rPr>
+          <w:rFonts w:ascii="Calibri" w:eastAsiaTheme="minorEastAsia" w:hAnsi="Calibri" w:cs="Calibri"/>
+          <w:sz w:val="24"/>
+          <w:szCs w:val="24"/>
+        </w:rPr>
+      </w:pPr>
+      <w:r>
+        <w:rPr>
+          <w:rFonts w:ascii="Calibri" w:eastAsiaTheme="minorEastAsia" w:hAnsi="Calibri" w:cs="Calibri"/>
+          <w:sz w:val="24"/>
+          <w:szCs w:val="24"/>
+        </w:rPr>
+        <w:t>95 percent confidence interval: (-0.</w:t>
+      </w:r>
+      <w:proofErr w:type="gramStart"/>
+      <w:r>
+        <w:rPr>
+          <w:rFonts w:ascii="Calibri" w:eastAsiaTheme="minorEastAsia" w:hAnsi="Calibri" w:cs="Calibri"/>
+          <w:sz w:val="24"/>
+          <w:szCs w:val="24"/>
+        </w:rPr>
+        <w:t>1498536,  0.4091639</w:t>
+      </w:r>
+      <w:proofErr w:type="gramEnd"/>
+      <w:r>
+        <w:rPr>
+          <w:rFonts w:ascii="Calibri" w:eastAsiaTheme="minorEastAsia" w:hAnsi="Calibri" w:cs="Calibri"/>
+          <w:sz w:val="24"/>
+          <w:szCs w:val="24"/>
+        </w:rPr>
+        <w:t>)</w:t>
+      </w:r>
+    </w:p>
+    <w:p>
+      <w:pPr>
+        <w:rPr>
+          <w:rFonts w:ascii="Calibri" w:eastAsiaTheme="minorEastAsia" w:hAnsi="Calibri" w:cs="Calibri"/>
+          <w:sz w:val="24"/>
+          <w:szCs w:val="24"/>
+        </w:rPr>
+      </w:pPr>
+      <w:r>
+        <w:rPr>
+          <w:rFonts w:ascii="Calibri" w:eastAsiaTheme="minorEastAsia" w:hAnsi="Calibri" w:cs="Calibri"/>
+          <w:sz w:val="24"/>
+          <w:szCs w:val="24"/>
+        </w:rPr>
+        <w:t>M</w:t>
+      </w:r>
+      <w:r>
+        <w:rPr>
+          <w:rFonts w:ascii="Calibri" w:eastAsiaTheme="minorEastAsia" w:hAnsi="Calibri" w:cs="Calibri"/>
+          <w:sz w:val="24"/>
+          <w:szCs w:val="24"/>
+        </w:rPr>
+        <w:t xml:space="preserve">ean </w:t>
+      </w:r>
+      <w:r>
+        <w:rPr>
+          <w:rFonts w:ascii="Calibri" w:eastAsiaTheme="minorEastAsia" w:hAnsi="Calibri" w:cs="Calibri"/>
+          <w:sz w:val="24"/>
+          <w:szCs w:val="24"/>
+        </w:rPr>
+        <w:t>D</w:t>
+      </w:r>
+      <w:r>
+        <w:rPr>
+          <w:rFonts w:ascii="Calibri" w:eastAsiaTheme="minorEastAsia" w:hAnsi="Calibri" w:cs="Calibri"/>
+          <w:sz w:val="24"/>
+          <w:szCs w:val="24"/>
+        </w:rPr>
+        <w:t>ifference</w:t>
+      </w:r>
+      <w:r>
+        <w:rPr>
+          <w:rFonts w:ascii="Calibri" w:eastAsiaTheme="minorEastAsia" w:hAnsi="Calibri" w:cs="Calibri"/>
+          <w:sz w:val="24"/>
+          <w:szCs w:val="24"/>
+        </w:rPr>
+        <w:t xml:space="preserve"> =</w:t>
+      </w:r>
+      <w:r>
+        <w:rPr>
+          <w:rFonts w:ascii="Calibri" w:eastAsiaTheme="minorEastAsia" w:hAnsi="Calibri" w:cs="Calibri"/>
+          <w:sz w:val="24"/>
+          <w:szCs w:val="24"/>
+        </w:rPr>
+        <w:t xml:space="preserve"> 0.1296552</w:t>
+      </w:r>
+    </w:p>
+    <w:p>
+      <w:pPr>
+        <w:rPr>
+          <w:rFonts w:ascii="Calibri" w:eastAsiaTheme="minorEastAsia" w:hAnsi="Calibri" w:cs="Calibri"/>
+          <w:sz w:val="24"/>
+          <w:szCs w:val="24"/>
+        </w:rPr>
+      </w:pPr>
+      <w:r>
+        <w:rPr>
+          <w:rFonts w:ascii="Calibri" w:eastAsiaTheme="minorEastAsia" w:hAnsi="Calibri" w:cs="Calibri"/>
+          <w:sz w:val="24"/>
+          <w:szCs w:val="24"/>
+        </w:rPr>
+        <w:t xml:space="preserve">t = 0.95019, </w:t>
+      </w:r>
+      <w:proofErr w:type="spellStart"/>
+      <w:r>
+        <w:rPr>
+          <w:rFonts w:ascii="Calibri" w:eastAsiaTheme="minorEastAsia" w:hAnsi="Calibri" w:cs="Calibri"/>
+          <w:sz w:val="24"/>
+          <w:szCs w:val="24"/>
+        </w:rPr>
+        <w:t>df</w:t>
+      </w:r>
+      <w:proofErr w:type="spellEnd"/>
+      <w:r>
+        <w:rPr>
+          <w:rFonts w:ascii="Calibri" w:eastAsiaTheme="minorEastAsia" w:hAnsi="Calibri" w:cs="Calibri"/>
+          <w:sz w:val="24"/>
+          <w:szCs w:val="24"/>
+        </w:rPr>
+        <w:t xml:space="preserve"> = 28, p-value = 0.3501</w:t>
+      </w:r>
+    </w:p>
+    <w:p>
+      <w:pPr>
+        <w:rPr>
+          <w:rFonts w:ascii="Calibri" w:eastAsiaTheme="minorEastAsia" w:hAnsi="Calibri" w:cs="Calibri"/>
+          <w:sz w:val="24"/>
+          <w:szCs w:val="24"/>
+        </w:rPr>
+      </w:pPr>
+    </w:p>
+    <w:p>
+      <w:pPr>
+        <w:rPr>
+          <w:rFonts w:ascii="Calibri" w:eastAsiaTheme="minorEastAsia" w:hAnsi="Calibri" w:cs="Calibri"/>
+          <w:sz w:val="24"/>
+          <w:szCs w:val="24"/>
+        </w:rPr>
+      </w:pPr>
+    </w:p>
+    <w:p>
+      <w:pPr>
+        <w:rPr>
+          <w:rFonts w:ascii="Calibri" w:eastAsiaTheme="minorEastAsia" w:hAnsi="Calibri" w:cs="Calibri"/>
+          <w:sz w:val="24"/>
+          <w:szCs w:val="24"/>
+        </w:rPr>
+      </w:pPr>
+    </w:p>
+    <w:p>
+      <w:pPr>
+        <w:rPr>
+          <w:rFonts w:ascii="Calibri" w:eastAsiaTheme="minorEastAsia" w:hAnsi="Calibri" w:cs="Calibri"/>
+          <w:sz w:val="24"/>
+          <w:szCs w:val="24"/>
+        </w:rPr>
+      </w:pPr>
+    </w:p>
+    <w:p>
+      <w:pPr>
+        <w:rPr>
+          <w:rFonts w:ascii="Calibri" w:eastAsiaTheme="minorEastAsia" w:hAnsi="Calibri" w:cs="Calibri"/>
+          <w:sz w:val="24"/>
+          <w:szCs w:val="24"/>
+        </w:rPr>
+      </w:pPr>
+    </w:p>
+    <w:p>
+      <w:pPr>
+        <w:pStyle w:val="ListParagraph"/>
+        <w:numPr>
+          <w:ilvl w:val="0"/>
+          <w:numId w:val="2"/>
+        </w:numPr>
+        <w:rPr>
+          <w:rFonts w:ascii="Calibri" w:eastAsiaTheme="minorEastAsia" w:hAnsi="Calibri" w:cs="Calibri"/>
+          <w:sz w:val="24"/>
+          <w:szCs w:val="24"/>
+        </w:rPr>
+      </w:pPr>
+      <w:r>
+        <w:rPr>
+          <w:rFonts w:ascii="Calibri" w:eastAsiaTheme="minorEastAsia" w:hAnsi="Calibri" w:cs="Calibri"/>
+          <w:sz w:val="24"/>
+          <w:szCs w:val="24"/>
+        </w:rPr>
+        <w:t xml:space="preserve">After comparing the findings from these two races, do you think that your findings about the differences in </w:t>
+      </w:r>
+      <w:proofErr w:type="gramStart"/>
+      <w:r>
+        <w:rPr>
+          <w:rFonts w:ascii="Calibri" w:eastAsiaTheme="minorEastAsia" w:hAnsi="Calibri" w:cs="Calibri"/>
+          <w:sz w:val="24"/>
+          <w:szCs w:val="24"/>
+        </w:rPr>
+        <w:t>run</w:t>
+      </w:r>
+      <w:proofErr w:type="gramEnd"/>
+      <w:r>
+        <w:rPr>
+          <w:rFonts w:ascii="Calibri" w:eastAsiaTheme="minorEastAsia" w:hAnsi="Calibri" w:cs="Calibri"/>
+          <w:sz w:val="24"/>
+          <w:szCs w:val="24"/>
+        </w:rPr>
+        <w:t xml:space="preserve"> times at Mont-Tremblant could be applied to other World Cup GS races? Discuss the limitations of this analysis.</w:t>
+      </w:r>
+    </w:p>
+    <w:p>
+      <w:pPr>
+        <w:rPr>
+          <w:rFonts w:ascii="Calibri" w:eastAsiaTheme="minorEastAsia" w:hAnsi="Calibri" w:cs="Calibri"/>
+          <w:sz w:val="24"/>
+          <w:szCs w:val="24"/>
+        </w:rPr>
+      </w:pPr>
+    </w:p>
+    <w:p>
+      <w:pPr>
+        <w:rPr>
+          <w:rFonts w:ascii="Calibri" w:eastAsiaTheme="minorEastAsia" w:hAnsi="Calibri" w:cs="Calibri"/>
+          <w:sz w:val="24"/>
+          <w:szCs w:val="24"/>
+        </w:rPr>
+      </w:pPr>
+    </w:p>
+    <w:p>
+      <w:pPr>
+        <w:rPr>
+          <w:rFonts w:ascii="Calibri" w:eastAsiaTheme="minorEastAsia" w:hAnsi="Calibri" w:cs="Calibri"/>
+          <w:sz w:val="24"/>
+          <w:szCs w:val="24"/>
+        </w:rPr>
+      </w:pPr>
+    </w:p>
+    <w:p>
+      <w:pPr>
+        <w:rPr>
+          <w:rFonts w:ascii="Calibri" w:eastAsiaTheme="minorEastAsia" w:hAnsi="Calibri" w:cs="Calibri"/>
+          <w:sz w:val="24"/>
+          <w:szCs w:val="24"/>
+        </w:rPr>
+      </w:pPr>
+    </w:p>
+    <w:p>
+      <w:pPr>
+        <w:rPr>
+          <w:rFonts w:ascii="Calibri" w:eastAsiaTheme="minorEastAsia" w:hAnsi="Calibri" w:cs="Calibri"/>
+          <w:sz w:val="24"/>
+          <w:szCs w:val="24"/>
+        </w:rPr>
+      </w:pPr>
+    </w:p>
+    <w:p>
+      <w:pPr>
+        <w:rPr>
+          <w:rFonts w:ascii="Calibri" w:eastAsiaTheme="minorEastAsia" w:hAnsi="Calibri" w:cs="Calibri"/>
+          <w:sz w:val="24"/>
+          <w:szCs w:val="24"/>
+        </w:rPr>
+      </w:pPr>
+    </w:p>
+    <w:p>
+      <w:pPr>
+        <w:pStyle w:val="ListParagraph"/>
+        <w:numPr>
+          <w:ilvl w:val="0"/>
+          <w:numId w:val="2"/>
+        </w:numPr>
+        <w:rPr>
+          <w:rFonts w:ascii="Calibri" w:eastAsiaTheme="minorEastAsia" w:hAnsi="Calibri" w:cs="Calibri"/>
+          <w:sz w:val="24"/>
+          <w:szCs w:val="24"/>
+        </w:rPr>
+      </w:pPr>
+      <w:r>
+        <w:rPr>
+          <w:rFonts w:ascii="Calibri" w:eastAsiaTheme="minorEastAsia" w:hAnsi="Calibri" w:cs="Calibri"/>
+          <w:sz w:val="24"/>
+          <w:szCs w:val="24"/>
+        </w:rPr>
+        <w:t xml:space="preserve">Let’s suppose that race officials would like the difficulty of the two courses </w:t>
+      </w:r>
+      <w:proofErr w:type="gramStart"/>
+      <w:r>
+        <w:rPr>
+          <w:rFonts w:ascii="Calibri" w:eastAsiaTheme="minorEastAsia" w:hAnsi="Calibri" w:cs="Calibri"/>
+          <w:sz w:val="24"/>
+          <w:szCs w:val="24"/>
+        </w:rPr>
+        <w:t>in a given</w:t>
+      </w:r>
+      <w:proofErr w:type="gramEnd"/>
+      <w:r>
+        <w:rPr>
+          <w:rFonts w:ascii="Calibri" w:eastAsiaTheme="minorEastAsia" w:hAnsi="Calibri" w:cs="Calibri"/>
+          <w:sz w:val="24"/>
+          <w:szCs w:val="24"/>
+        </w:rPr>
+        <w:t xml:space="preserve"> race to be roughly the same. Which race (Mont Tremblant or Copper) would you say meets this goal and why?</w:t>
+      </w:r>
+    </w:p>
+    <w:p>
+      <w:pPr>
+        <w:rPr>
+          <w:rFonts w:ascii="Calibri" w:hAnsi="Calibri" w:cs="Calibri"/>
+          <w:sz w:val="24"/>
+          <w:szCs w:val="24"/>
+        </w:rPr>
+      </w:pPr>
+    </w:p>
+    <w:p>
+      <w:pPr>
+        <w:rPr>
+          <w:rFonts w:ascii="Calibri" w:hAnsi="Calibri" w:cs="Calibri"/>
+          <w:color w:val="FF0000"/>
+        </w:rPr>
+      </w:pPr>
     </w:p>
     <w:p>
       <w:pPr>
@@ -984,6 +1053,95 @@
 <file path=word/numbering.xml><?xml version="1.0" encoding="utf-8"?>
 <w:numbering xmlns:wpc="http://schemas.microsoft.com/office/word/2010/wordprocessingCanvas" xmlns:cx="http://schemas.microsoft.com/office/drawing/2014/chartex" xmlns:cx1="http://schemas.microsoft.com/office/drawing/2015/9/8/chartex" xmlns:cx2="http://schemas.microsoft.com/office/drawing/2015/10/21/chartex" xmlns:cx3="http://schemas.microsoft.com/office/drawing/2016/5/9/chartex" xmlns:cx4="http://schemas.microsoft.com/office/drawing/2016/5/10/chartex" xmlns:cx5="http://schemas.microsoft.com/office/drawing/2016/5/11/chartex" xmlns:cx6="http://schemas.microsoft.com/office/drawing/2016/5/12/chartex" xmlns:cx7="http://schemas.microsoft.com/office/drawing/2016/5/13/chartex" xmlns:cx8="http://schemas.microsoft.com/office/drawing/2016/5/14/chartex" xmlns:mc="http://schemas.openxmlformats.org/markup-compatibility/2006" xmlns:aink="http://schemas.microsoft.com/office/drawing/2016/ink" xmlns:am3d="http://schemas.microsoft.com/office/drawing/2017/model3d" xmlns:o="urn:schemas-microsoft-com:office:office" xmlns:oel="http://schemas.microsoft.com/office/2019/extlst" xmlns:r="http://schemas.openxmlformats.org/officeDocument/2006/relationships" xmlns:m="http://schemas.openxmlformats.org/officeDocument/2006/math" xmlns:v="urn:schemas-microsoft-com:vml" xmlns:wp14="http://schemas.microsoft.com/office/word/2010/wordprocessingDrawing" xmlns:wp="http://schemas.openxmlformats.org/drawingml/2006/wordprocessingDrawing" xmlns:w10="urn:schemas-microsoft-com:office:word" xmlns:w="http://schemas.openxmlformats.org/wordprocessingml/2006/main" xmlns:w14="http://schemas.microsoft.com/office/word/2010/wordml" xmlns:w15="http://schemas.microsoft.com/office/word/2012/wordml" xmlns:w16cex="http://schemas.microsoft.com/office/word/2018/wordml/cex" xmlns:w16cid="http://schemas.microsoft.com/office/word/2016/wordml/cid" xmlns:w16="http://schemas.microsoft.com/office/word/2018/wordml" xmlns:w16du="http://schemas.microsoft.com/office/word/2023/wordml/word16du" xmlns:w16sdtdh="http://schemas.microsoft.com/office/word/2020/wordml/sdtdatahash" xmlns:w16sdtfl="http://schemas.microsoft.com/office/word/2024/wordml/sdtformatlock" xmlns:w16se="http://schemas.microsoft.com/office/word/2015/wordml/symex" xmlns:wpg="http://schemas.microsoft.com/office/word/2010/wordprocessingGroup" xmlns:wpi="http://schemas.microsoft.com/office/word/2010/wordprocessingInk" xmlns:wne="http://schemas.microsoft.com/office/word/2006/wordml" xmlns:wps="http://schemas.microsoft.com/office/word/2010/wordprocessingShape" mc:Ignorable="w14 w15 w16se w16cid w16 w16cex w16sdtdh w16sdtfl w16du wp14">
   <w:abstractNum w:abstractNumId="0" w15:restartNumberingAfterBreak="0">
+    <w:nsid w:val="11407F83"/>
+    <w:multiLevelType w:val="hybridMultilevel"/>
+    <w:tmpl w:val="BC267616"/>
+    <w:lvl w:ilvl="0" w:tplc="FFFFFFFF">
+      <w:start w:val="1"/>
+      <w:numFmt w:val="decimal"/>
+      <w:lvlText w:val="%1."/>
+      <w:lvlJc w:val="left"/>
+      <w:pPr>
+        <w:ind w:left="720" w:hanging="360"/>
+      </w:pPr>
+      <w:rPr>
+        <w:rFonts w:hint="default"/>
+      </w:rPr>
+    </w:lvl>
+    <w:lvl w:ilvl="1" w:tplc="FFFFFFFF" w:tentative="1">
+      <w:start w:val="1"/>
+      <w:numFmt w:val="lowerLetter"/>
+      <w:lvlText w:val="%2."/>
+      <w:lvlJc w:val="left"/>
+      <w:pPr>
+        <w:ind w:left="1440" w:hanging="360"/>
+      </w:pPr>
+    </w:lvl>
+    <w:lvl w:ilvl="2" w:tplc="FFFFFFFF" w:tentative="1">
+      <w:start w:val="1"/>
+      <w:numFmt w:val="lowerRoman"/>
+      <w:lvlText w:val="%3."/>
+      <w:lvlJc w:val="right"/>
+      <w:pPr>
+        <w:ind w:left="2160" w:hanging="180"/>
+      </w:pPr>
+    </w:lvl>
+    <w:lvl w:ilvl="3" w:tplc="FFFFFFFF" w:tentative="1">
+      <w:start w:val="1"/>
+      <w:numFmt w:val="decimal"/>
+      <w:lvlText w:val="%4."/>
+      <w:lvlJc w:val="left"/>
+      <w:pPr>
+        <w:ind w:left="2880" w:hanging="360"/>
+      </w:pPr>
+    </w:lvl>
+    <w:lvl w:ilvl="4" w:tplc="FFFFFFFF" w:tentative="1">
+      <w:start w:val="1"/>
+      <w:numFmt w:val="lowerLetter"/>
+      <w:lvlText w:val="%5."/>
+      <w:lvlJc w:val="left"/>
+      <w:pPr>
+        <w:ind w:left="3600" w:hanging="360"/>
+      </w:pPr>
+    </w:lvl>
+    <w:lvl w:ilvl="5" w:tplc="FFFFFFFF" w:tentative="1">
+      <w:start w:val="1"/>
+      <w:numFmt w:val="lowerRoman"/>
+      <w:lvlText w:val="%6."/>
+      <w:lvlJc w:val="right"/>
+      <w:pPr>
+        <w:ind w:left="4320" w:hanging="180"/>
+      </w:pPr>
+    </w:lvl>
+    <w:lvl w:ilvl="6" w:tplc="FFFFFFFF" w:tentative="1">
+      <w:start w:val="1"/>
+      <w:numFmt w:val="decimal"/>
+      <w:lvlText w:val="%7."/>
+      <w:lvlJc w:val="left"/>
+      <w:pPr>
+        <w:ind w:left="5040" w:hanging="360"/>
+      </w:pPr>
+    </w:lvl>
+    <w:lvl w:ilvl="7" w:tplc="FFFFFFFF" w:tentative="1">
+      <w:start w:val="1"/>
+      <w:numFmt w:val="lowerLetter"/>
+      <w:lvlText w:val="%8."/>
+      <w:lvlJc w:val="left"/>
+      <w:pPr>
+        <w:ind w:left="5760" w:hanging="360"/>
+      </w:pPr>
+    </w:lvl>
+    <w:lvl w:ilvl="8" w:tplc="FFFFFFFF" w:tentative="1">
+      <w:start w:val="1"/>
+      <w:numFmt w:val="lowerRoman"/>
+      <w:lvlText w:val="%9."/>
+      <w:lvlJc w:val="right"/>
+      <w:pPr>
+        <w:ind w:left="6480" w:hanging="180"/>
+      </w:pPr>
+    </w:lvl>
+  </w:abstractNum>
+  <w:abstractNum w:abstractNumId="1" w15:restartNumberingAfterBreak="0">
     <w:nsid w:val="29210154"/>
     <w:multiLevelType w:val="hybridMultilevel"/>
     <w:tmpl w:val="BC267616"/>
@@ -1073,6 +1231,9 @@
     </w:lvl>
   </w:abstractNum>
   <w:num w:numId="1" w16cid:durableId="2030641863">
+    <w:abstractNumId w:val="1"/>
+  </w:num>
+  <w:num w:numId="2" w16cid:durableId="714546410">
     <w:abstractNumId w:val="0"/>
   </w:num>
 </w:numbering>

</xml_diff>

<commit_message>
Updated files for module_1 (paired data module)
</commit_message>
<xml_diff>
--- a/emiliaagostinelli/module_1/Tremblant_Worksheet.docx
+++ b/emiliaagostinelli/module_1/Tremblant_Worksheet.docx
@@ -38,7 +38,7 @@
           <w:sz w:val="24"/>
           <w:szCs w:val="24"/>
         </w:rPr>
-        <w:t xml:space="preserve">In World Cup Giant Slalom (GS), there are two runs. Only the thirty fastest racers from the first run take a second run. If a racer is disqualified (DSQ) or </w:t>
+        <w:t xml:space="preserve">World Cup Giant Slalom (GS) is a high-speed alpine skiing event where skiers navigate a series of wide, rhythmic turns through pairs of gates. In World Cup GS, there are two runs. Only the thirty fastest racers on the first run take a second run. If a racer is disqualified (DSQ) or </w:t>
       </w:r>
       <w:proofErr w:type="gramStart"/>
       <w:r>
@@ -56,55 +56,39 @@
           <w:sz w:val="24"/>
           <w:szCs w:val="24"/>
         </w:rPr>
-        <w:t xml:space="preserve"> not finish (DNF) their first run, they do not take a second run. The order for the first run is determined by taking all racers and ordering them by their World Cup points, from highest to lowest. From that, the top 30 racers are put into three groups. The best seven racers are randomly assigning them a bib 1-7. The next eight best competitors are randomly assigned a bib 8-15. The next best 15 racers are randomly assigned a bib 16-30. The remaining racers go in descending order of points. </w:t>
-      </w:r>
-      <w:r>
-        <w:rPr>
-          <w:rFonts w:ascii="Calibri" w:hAnsi="Calibri" w:cs="Calibri"/>
-          <w:sz w:val="24"/>
-          <w:szCs w:val="24"/>
-        </w:rPr>
-        <w:t>For the second run</w:t>
-      </w:r>
-      <w:r>
-        <w:rPr>
-          <w:rFonts w:ascii="Calibri" w:hAnsi="Calibri" w:cs="Calibri"/>
-          <w:sz w:val="24"/>
-          <w:szCs w:val="24"/>
-        </w:rPr>
-        <w:t>,</w:t>
-      </w:r>
-      <w:r>
-        <w:rPr>
-          <w:rFonts w:ascii="Calibri" w:hAnsi="Calibri" w:cs="Calibri"/>
-          <w:sz w:val="24"/>
-          <w:szCs w:val="24"/>
-        </w:rPr>
-        <w:t xml:space="preserve"> the course is reset.</w:t>
-      </w:r>
-      <w:r>
-        <w:rPr>
-          <w:rFonts w:ascii="Calibri" w:hAnsi="Calibri" w:cs="Calibri"/>
-          <w:sz w:val="24"/>
-          <w:szCs w:val="24"/>
-        </w:rPr>
-        <w:t xml:space="preserve"> </w:t>
-      </w:r>
-      <w:r>
-        <w:rPr>
-          <w:rFonts w:ascii="Calibri" w:hAnsi="Calibri" w:cs="Calibri"/>
-          <w:sz w:val="24"/>
-          <w:szCs w:val="24"/>
-        </w:rPr>
-        <w:t>C</w:t>
-      </w:r>
-      <w:r>
-        <w:rPr>
-          <w:rFonts w:ascii="Calibri" w:hAnsi="Calibri" w:cs="Calibri"/>
-          <w:sz w:val="24"/>
-          <w:szCs w:val="24"/>
-        </w:rPr>
-        <w:t>ompetitors race in reverse order of their results on the first run, so the 30th fastest racer on the first run goes 1st on the second run and so on. This data set includes data from only the top thirty finishers as any racers who placed higher than 30th do not take a second run.</w:t>
+        <w:t xml:space="preserve"> not finish (DNF) their first run, they do not take a second run. The order for the first run is determined by taking all racers and ordering them by their World Cup points, from highest to lowest. World Cup points are a measure to rank a skier's performance throughout the season.</w:t>
+      </w:r>
+      <w:r>
+        <w:rPr>
+          <w:rFonts w:ascii="Calibri" w:hAnsi="Calibri" w:cs="Calibri"/>
+          <w:sz w:val="24"/>
+          <w:szCs w:val="24"/>
+        </w:rPr>
+        <w:t xml:space="preserve"> The best ranked skier has the highest points.</w:t>
+      </w:r>
+      <w:r>
+        <w:rPr>
+          <w:rFonts w:ascii="Calibri" w:hAnsi="Calibri" w:cs="Calibri"/>
+          <w:sz w:val="24"/>
+          <w:szCs w:val="24"/>
+        </w:rPr>
+        <w:t xml:space="preserve"> From th</w:t>
+      </w:r>
+      <w:r>
+        <w:rPr>
+          <w:rFonts w:ascii="Calibri" w:hAnsi="Calibri" w:cs="Calibri"/>
+          <w:sz w:val="24"/>
+          <w:szCs w:val="24"/>
+        </w:rPr>
+        <w:t>ere</w:t>
+      </w:r>
+      <w:r>
+        <w:rPr>
+          <w:rFonts w:ascii="Calibri" w:hAnsi="Calibri" w:cs="Calibri"/>
+          <w:sz w:val="24"/>
+          <w:szCs w:val="24"/>
+        </w:rPr>
+        <w:t>, the top 30 racers are put into three groups. The best seven racers are randomly assigned a bib 1-7. The next eight best competitors are randomly assigned a bib 8-15. The next best 15 racers are randomly assigned a bib 16-30. The remaining racers go in descending order of World Cup points. A second run takes place a couple hours after the first run is completed, allowing time for racers to have a break, for the course to be reset, and for racers to inspect the new course. Competitors race in reverse order of their results on the first run, so the 30th fastest racer on the first run goes 1st on the second run and so on. This data set includes data from only the top thirty finishers as any racers who placed higher than 30th do not take a second run.</w:t>
       </w:r>
       <w:r>
         <w:rPr>
@@ -114,15 +98,6 @@
         </w:rPr>
         <w:t xml:space="preserve"> In this worksheet, you will be tasked with understanding your data, finding summary statistics, performing a t-test, constructing a confidence interval, and interpreting your findings in the context of this setting. The data is stored in Tremblant_diff.csv.</w:t>
       </w:r>
-    </w:p>
-    <w:p>
-      <w:pPr>
-        <w:rPr>
-          <w:rFonts w:ascii="Calibri" w:hAnsi="Calibri" w:cs="Calibri"/>
-          <w:sz w:val="24"/>
-          <w:szCs w:val="24"/>
-        </w:rPr>
-      </w:pPr>
     </w:p>
     <w:p>
       <w:pPr>
@@ -171,7 +146,7 @@
           <w:sz w:val="24"/>
           <w:szCs w:val="24"/>
         </w:rPr>
-        <w:t xml:space="preserve"> times may be different. (As a reminder, the course is reset between runs.)</w:t>
+        <w:t xml:space="preserve"> times may be different. (As a reminder, the course is reset between runs, and there are a couple hours between runs.)</w:t>
       </w:r>
     </w:p>
     <w:p>
@@ -309,24 +284,6 @@
     </w:p>
     <w:p>
       <w:pPr>
-        <w:rPr>
-          <w:rFonts w:ascii="Calibri" w:hAnsi="Calibri" w:cs="Calibri"/>
-          <w:sz w:val="24"/>
-          <w:szCs w:val="24"/>
-        </w:rPr>
-      </w:pPr>
-    </w:p>
-    <w:p>
-      <w:pPr>
-        <w:rPr>
-          <w:rFonts w:ascii="Calibri" w:hAnsi="Calibri" w:cs="Calibri"/>
-          <w:sz w:val="24"/>
-          <w:szCs w:val="24"/>
-        </w:rPr>
-      </w:pPr>
-    </w:p>
-    <w:p>
-      <w:pPr>
         <w:pStyle w:val="ListParagraph"/>
         <w:numPr>
           <w:ilvl w:val="0"/>
@@ -345,7 +302,7 @@
           <w:szCs w:val="24"/>
         </w:rPr>
         <w:lastRenderedPageBreak/>
-        <w:t>Above, we saw that Run1_Time is on average faster than Run2_Time for this race, but we can p</w:t>
+        <w:t>Above, we saw that Run1_Time is on average faster than Run2_Time for this race. Is this trend strong enough to generalize to all elite racers? To assess this, we can p</w:t>
       </w:r>
       <w:r>
         <w:rPr>
@@ -434,51 +391,67 @@
       <w:pPr>
         <w:rPr>
           <w:rFonts w:ascii="Calibri" w:hAnsi="Calibri" w:cs="Calibri"/>
-          <w:sz w:val="24"/>
-          <w:szCs w:val="24"/>
-        </w:rPr>
-      </w:pPr>
-    </w:p>
-    <w:p>
-      <w:pPr>
-        <w:rPr>
-          <w:rFonts w:ascii="Calibri" w:hAnsi="Calibri" w:cs="Calibri"/>
-          <w:sz w:val="24"/>
-          <w:szCs w:val="24"/>
-        </w:rPr>
-      </w:pPr>
-    </w:p>
-    <w:p>
-      <w:pPr>
-        <w:rPr>
-          <w:rFonts w:ascii="Calibri" w:hAnsi="Calibri" w:cs="Calibri"/>
-          <w:sz w:val="24"/>
-          <w:szCs w:val="24"/>
-        </w:rPr>
-      </w:pPr>
-    </w:p>
-    <w:p>
-      <w:pPr>
-        <w:rPr>
-          <w:rFonts w:ascii="Calibri" w:hAnsi="Calibri" w:cs="Calibri"/>
-          <w:sz w:val="24"/>
-          <w:szCs w:val="24"/>
-        </w:rPr>
-      </w:pPr>
-    </w:p>
-    <w:p>
-      <w:pPr>
-        <w:rPr>
-          <w:rFonts w:ascii="Calibri" w:hAnsi="Calibri" w:cs="Calibri"/>
-          <w:sz w:val="24"/>
-          <w:szCs w:val="24"/>
-        </w:rPr>
-      </w:pPr>
-    </w:p>
-    <w:p>
-      <w:pPr>
-        <w:rPr>
-          <w:rFonts w:ascii="Calibri" w:hAnsi="Calibri" w:cs="Calibri"/>
+          <w:color w:val="FF0000"/>
+          <w:sz w:val="24"/>
+          <w:szCs w:val="24"/>
+        </w:rPr>
+      </w:pPr>
+    </w:p>
+    <w:p>
+      <w:pPr>
+        <w:rPr>
+          <w:rFonts w:ascii="Calibri" w:hAnsi="Calibri" w:cs="Calibri"/>
+          <w:color w:val="FF0000"/>
+          <w:sz w:val="24"/>
+          <w:szCs w:val="24"/>
+        </w:rPr>
+      </w:pPr>
+    </w:p>
+    <w:p>
+      <w:pPr>
+        <w:rPr>
+          <w:rFonts w:ascii="Calibri" w:hAnsi="Calibri" w:cs="Calibri"/>
+          <w:color w:val="FF0000"/>
+          <w:sz w:val="24"/>
+          <w:szCs w:val="24"/>
+        </w:rPr>
+      </w:pPr>
+    </w:p>
+    <w:p>
+      <w:pPr>
+        <w:rPr>
+          <w:rFonts w:ascii="Calibri" w:hAnsi="Calibri" w:cs="Calibri"/>
+          <w:color w:val="FF0000"/>
+          <w:sz w:val="24"/>
+          <w:szCs w:val="24"/>
+        </w:rPr>
+      </w:pPr>
+    </w:p>
+    <w:p>
+      <w:pPr>
+        <w:rPr>
+          <w:rFonts w:ascii="Calibri" w:hAnsi="Calibri" w:cs="Calibri"/>
+          <w:color w:val="FF0000"/>
+          <w:sz w:val="24"/>
+          <w:szCs w:val="24"/>
+        </w:rPr>
+      </w:pPr>
+    </w:p>
+    <w:p>
+      <w:pPr>
+        <w:rPr>
+          <w:rFonts w:ascii="Calibri" w:hAnsi="Calibri" w:cs="Calibri"/>
+          <w:color w:val="FF0000"/>
+          <w:sz w:val="24"/>
+          <w:szCs w:val="24"/>
+        </w:rPr>
+      </w:pPr>
+    </w:p>
+    <w:p>
+      <w:pPr>
+        <w:rPr>
+          <w:rFonts w:ascii="Calibri" w:hAnsi="Calibri" w:cs="Calibri"/>
+          <w:color w:val="FF0000"/>
           <w:sz w:val="24"/>
           <w:szCs w:val="24"/>
         </w:rPr>
@@ -512,7 +485,7 @@
           <w:sz w:val="24"/>
           <w:szCs w:val="24"/>
         </w:rPr>
-        <w:t xml:space="preserve">From the results of the hypothesis test, we observe that Run1_Time is on average significantly faster than Run2_Time. Suppose that this data is a sample from a wider population of elite racers. We may want to understand the range of values that the true run time difference can take on for the entire population, not just this sample. </w:t>
+        <w:t xml:space="preserve">From the results of the hypothesis test, we observe that Run1_Time is on average significantly faster than Run2_Time. Again, suppose that this data is a sample from a wider population of elite racers. We may want to understand the range of values that the true run time difference can take on for the entire population, not just this sample. </w:t>
       </w:r>
       <w:r>
         <w:rPr>
@@ -530,15 +503,6 @@
         </w:rPr>
         <w:t xml:space="preserve"> and give an interpretation of this interval. As a reminder, we are comparing the time to complete the runs. (If computing by hand, use n = 27 as three racers DNF on Run 2).</w:t>
       </w:r>
-    </w:p>
-    <w:p>
-      <w:pPr>
-        <w:rPr>
-          <w:rFonts w:ascii="Calibri" w:hAnsi="Calibri" w:cs="Calibri"/>
-          <w:sz w:val="24"/>
-          <w:szCs w:val="24"/>
-        </w:rPr>
-      </w:pPr>
     </w:p>
     <w:p>
       <w:pPr>
@@ -613,62 +577,29 @@
           <w:sz w:val="24"/>
           <w:szCs w:val="24"/>
         </w:rPr>
-        <w:t xml:space="preserve">How do your findings in questions </w:t>
-      </w:r>
-      <w:r>
-        <w:rPr>
-          <w:rFonts w:ascii="Calibri" w:hAnsi="Calibri" w:cs="Calibri"/>
-          <w:sz w:val="24"/>
-          <w:szCs w:val="24"/>
-        </w:rPr>
-        <w:t>3</w:t>
-      </w:r>
-      <w:r>
-        <w:rPr>
-          <w:rFonts w:ascii="Calibri" w:hAnsi="Calibri" w:cs="Calibri"/>
-          <w:sz w:val="24"/>
-          <w:szCs w:val="24"/>
-        </w:rPr>
-        <w:t xml:space="preserve"> and </w:t>
-      </w:r>
-      <w:r>
-        <w:rPr>
-          <w:rFonts w:ascii="Calibri" w:hAnsi="Calibri" w:cs="Calibri"/>
-          <w:sz w:val="24"/>
-          <w:szCs w:val="24"/>
-        </w:rPr>
-        <w:t>4</w:t>
-      </w:r>
-      <w:r>
-        <w:rPr>
-          <w:rFonts w:ascii="Calibri" w:hAnsi="Calibri" w:cs="Calibri"/>
-          <w:sz w:val="24"/>
-          <w:szCs w:val="24"/>
-        </w:rPr>
-        <w:t xml:space="preserve"> relate?</w:t>
-      </w:r>
-      <w:r>
-        <w:rPr>
-          <w:rFonts w:ascii="Calibri" w:hAnsi="Calibri" w:cs="Calibri"/>
-          <w:sz w:val="24"/>
-          <w:szCs w:val="24"/>
-        </w:rPr>
-        <w:t xml:space="preserve"> What could your findings reveal about the differences between the courses on the first and second runs?</w:t>
-      </w:r>
-    </w:p>
-    <w:p>
-      <w:pPr>
-        <w:rPr>
-          <w:rFonts w:ascii="Calibri" w:hAnsi="Calibri" w:cs="Calibri"/>
-          <w:sz w:val="24"/>
-          <w:szCs w:val="24"/>
-        </w:rPr>
-      </w:pPr>
-    </w:p>
-    <w:p>
-      <w:pPr>
-        <w:rPr>
-          <w:rFonts w:ascii="Calibri" w:eastAsiaTheme="minorEastAsia" w:hAnsi="Calibri" w:cs="Calibri"/>
+        <w:t>Does the interpretation of the confidence interval support your conclusion from the hypothesis test</w:t>
+      </w:r>
+      <w:r>
+        <w:rPr>
+          <w:rFonts w:ascii="Calibri" w:hAnsi="Calibri" w:cs="Calibri"/>
+          <w:sz w:val="24"/>
+          <w:szCs w:val="24"/>
+        </w:rPr>
+        <w:t>?</w:t>
+      </w:r>
+      <w:r>
+        <w:rPr>
+          <w:rFonts w:ascii="Calibri" w:hAnsi="Calibri" w:cs="Calibri"/>
+          <w:sz w:val="24"/>
+          <w:szCs w:val="24"/>
+        </w:rPr>
+        <w:t xml:space="preserve"> What if the confidence interval spanned from -1.18 to +0.62? </w:t>
+      </w:r>
+    </w:p>
+    <w:p>
+      <w:pPr>
+        <w:rPr>
+          <w:rFonts w:ascii="Calibri" w:hAnsi="Calibri" w:cs="Calibri"/>
           <w:color w:val="FF0000"/>
           <w:sz w:val="24"/>
           <w:szCs w:val="24"/>
@@ -678,8 +609,7 @@
     <w:p>
       <w:pPr>
         <w:rPr>
-          <w:rFonts w:ascii="Calibri" w:eastAsiaTheme="minorEastAsia" w:hAnsi="Calibri" w:cs="Calibri"/>
-          <w:color w:val="FF0000"/>
+          <w:rFonts w:ascii="Calibri" w:hAnsi="Calibri" w:cs="Calibri"/>
           <w:sz w:val="24"/>
           <w:szCs w:val="24"/>
         </w:rPr>
@@ -693,188 +623,56 @@
           <w:numId w:val="2"/>
         </w:numPr>
         <w:rPr>
-          <w:rFonts w:ascii="Calibri" w:eastAsiaTheme="minorEastAsia" w:hAnsi="Calibri" w:cs="Calibri"/>
-          <w:sz w:val="24"/>
-          <w:szCs w:val="24"/>
-        </w:rPr>
-      </w:pPr>
-      <w:r>
-        <w:rPr>
-          <w:rFonts w:ascii="Calibri" w:eastAsiaTheme="minorEastAsia" w:hAnsi="Calibri" w:cs="Calibri"/>
+          <w:rFonts w:ascii="Calibri" w:hAnsi="Calibri" w:cs="Calibri"/>
+          <w:sz w:val="24"/>
+          <w:szCs w:val="24"/>
+        </w:rPr>
+      </w:pPr>
+      <w:r>
+        <w:rPr>
+          <w:rFonts w:ascii="Calibri" w:hAnsi="Calibri" w:cs="Calibri"/>
           <w:sz w:val="24"/>
           <w:szCs w:val="24"/>
         </w:rPr>
         <w:lastRenderedPageBreak/>
-        <w:t>Now, let’s compare our findings to another women’s world cup giant slalom race at Copper Mountain. Below are the results from a test for difference in mean run times.  Interpret the results from the test and the 95% CI. What does this reveal about the differences between courses on the first and second run?</w:t>
-      </w:r>
-    </w:p>
-    <w:p>
-      <w:pPr>
-        <w:rPr>
-          <w:rFonts w:ascii="Calibri" w:eastAsiaTheme="minorEastAsia" w:hAnsi="Calibri" w:cs="Calibri"/>
-          <w:sz w:val="24"/>
-          <w:szCs w:val="24"/>
-        </w:rPr>
-      </w:pPr>
-      <w:r>
-        <w:rPr>
-          <w:rFonts w:ascii="Calibri" w:eastAsiaTheme="minorEastAsia" w:hAnsi="Calibri" w:cs="Calibri"/>
-          <w:sz w:val="24"/>
-          <w:szCs w:val="24"/>
-        </w:rPr>
-        <w:t>95 percent confidence interval: (-0.</w:t>
-      </w:r>
-      <w:proofErr w:type="gramStart"/>
-      <w:r>
-        <w:rPr>
-          <w:rFonts w:ascii="Calibri" w:eastAsiaTheme="minorEastAsia" w:hAnsi="Calibri" w:cs="Calibri"/>
-          <w:sz w:val="24"/>
-          <w:szCs w:val="24"/>
-        </w:rPr>
-        <w:t>1498536,  0.4091639</w:t>
-      </w:r>
-      <w:proofErr w:type="gramEnd"/>
-      <w:r>
-        <w:rPr>
-          <w:rFonts w:ascii="Calibri" w:eastAsiaTheme="minorEastAsia" w:hAnsi="Calibri" w:cs="Calibri"/>
-          <w:sz w:val="24"/>
-          <w:szCs w:val="24"/>
-        </w:rPr>
-        <w:t>)</w:t>
-      </w:r>
-    </w:p>
-    <w:p>
-      <w:pPr>
-        <w:rPr>
-          <w:rFonts w:ascii="Calibri" w:eastAsiaTheme="minorEastAsia" w:hAnsi="Calibri" w:cs="Calibri"/>
-          <w:sz w:val="24"/>
-          <w:szCs w:val="24"/>
-        </w:rPr>
-      </w:pPr>
-      <w:r>
-        <w:rPr>
-          <w:rFonts w:ascii="Calibri" w:eastAsiaTheme="minorEastAsia" w:hAnsi="Calibri" w:cs="Calibri"/>
-          <w:sz w:val="24"/>
-          <w:szCs w:val="24"/>
-        </w:rPr>
-        <w:t>M</w:t>
-      </w:r>
-      <w:r>
-        <w:rPr>
-          <w:rFonts w:ascii="Calibri" w:eastAsiaTheme="minorEastAsia" w:hAnsi="Calibri" w:cs="Calibri"/>
-          <w:sz w:val="24"/>
-          <w:szCs w:val="24"/>
-        </w:rPr>
-        <w:t xml:space="preserve">ean </w:t>
-      </w:r>
-      <w:r>
-        <w:rPr>
-          <w:rFonts w:ascii="Calibri" w:eastAsiaTheme="minorEastAsia" w:hAnsi="Calibri" w:cs="Calibri"/>
-          <w:sz w:val="24"/>
-          <w:szCs w:val="24"/>
-        </w:rPr>
-        <w:t>D</w:t>
-      </w:r>
-      <w:r>
-        <w:rPr>
-          <w:rFonts w:ascii="Calibri" w:eastAsiaTheme="minorEastAsia" w:hAnsi="Calibri" w:cs="Calibri"/>
-          <w:sz w:val="24"/>
-          <w:szCs w:val="24"/>
-        </w:rPr>
-        <w:t>ifference</w:t>
-      </w:r>
-      <w:r>
-        <w:rPr>
-          <w:rFonts w:ascii="Calibri" w:eastAsiaTheme="minorEastAsia" w:hAnsi="Calibri" w:cs="Calibri"/>
-          <w:sz w:val="24"/>
-          <w:szCs w:val="24"/>
-        </w:rPr>
-        <w:t xml:space="preserve"> =</w:t>
-      </w:r>
-      <w:r>
-        <w:rPr>
-          <w:rFonts w:ascii="Calibri" w:eastAsiaTheme="minorEastAsia" w:hAnsi="Calibri" w:cs="Calibri"/>
-          <w:sz w:val="24"/>
-          <w:szCs w:val="24"/>
-        </w:rPr>
-        <w:t xml:space="preserve"> 0.1296552</w:t>
-      </w:r>
-    </w:p>
-    <w:p>
-      <w:pPr>
-        <w:rPr>
-          <w:rFonts w:ascii="Calibri" w:eastAsiaTheme="minorEastAsia" w:hAnsi="Calibri" w:cs="Calibri"/>
-          <w:sz w:val="24"/>
-          <w:szCs w:val="24"/>
-        </w:rPr>
-      </w:pPr>
-      <w:r>
-        <w:rPr>
-          <w:rFonts w:ascii="Calibri" w:eastAsiaTheme="minorEastAsia" w:hAnsi="Calibri" w:cs="Calibri"/>
-          <w:sz w:val="24"/>
-          <w:szCs w:val="24"/>
-        </w:rPr>
-        <w:t xml:space="preserve">t = 0.95019, </w:t>
-      </w:r>
-      <w:proofErr w:type="spellStart"/>
-      <w:r>
-        <w:rPr>
-          <w:rFonts w:ascii="Calibri" w:eastAsiaTheme="minorEastAsia" w:hAnsi="Calibri" w:cs="Calibri"/>
-          <w:sz w:val="24"/>
-          <w:szCs w:val="24"/>
-        </w:rPr>
-        <w:t>df</w:t>
-      </w:r>
-      <w:proofErr w:type="spellEnd"/>
-      <w:r>
-        <w:rPr>
-          <w:rFonts w:ascii="Calibri" w:eastAsiaTheme="minorEastAsia" w:hAnsi="Calibri" w:cs="Calibri"/>
-          <w:sz w:val="24"/>
-          <w:szCs w:val="24"/>
-        </w:rPr>
-        <w:t xml:space="preserve"> = 28, p-value = 0.3501</w:t>
-      </w:r>
-    </w:p>
-    <w:p>
-      <w:pPr>
-        <w:rPr>
-          <w:rFonts w:ascii="Calibri" w:eastAsiaTheme="minorEastAsia" w:hAnsi="Calibri" w:cs="Calibri"/>
-          <w:sz w:val="24"/>
-          <w:szCs w:val="24"/>
-        </w:rPr>
-      </w:pPr>
-    </w:p>
-    <w:p>
-      <w:pPr>
-        <w:rPr>
-          <w:rFonts w:ascii="Calibri" w:eastAsiaTheme="minorEastAsia" w:hAnsi="Calibri" w:cs="Calibri"/>
-          <w:sz w:val="24"/>
-          <w:szCs w:val="24"/>
-        </w:rPr>
-      </w:pPr>
-    </w:p>
-    <w:p>
-      <w:pPr>
-        <w:rPr>
-          <w:rFonts w:ascii="Calibri" w:eastAsiaTheme="minorEastAsia" w:hAnsi="Calibri" w:cs="Calibri"/>
-          <w:sz w:val="24"/>
-          <w:szCs w:val="24"/>
-        </w:rPr>
-      </w:pPr>
-    </w:p>
-    <w:p>
-      <w:pPr>
-        <w:rPr>
-          <w:rFonts w:ascii="Calibri" w:eastAsiaTheme="minorEastAsia" w:hAnsi="Calibri" w:cs="Calibri"/>
-          <w:sz w:val="24"/>
-          <w:szCs w:val="24"/>
-        </w:rPr>
-      </w:pPr>
-    </w:p>
-    <w:p>
-      <w:pPr>
-        <w:rPr>
-          <w:rFonts w:ascii="Calibri" w:eastAsiaTheme="minorEastAsia" w:hAnsi="Calibri" w:cs="Calibri"/>
+        <w:t>What could your findings reveal about the differences between the courses on the first and second runs?</w:t>
+      </w:r>
+    </w:p>
+    <w:p>
+      <w:pPr>
+        <w:rPr>
+          <w:rFonts w:ascii="Calibri" w:eastAsiaTheme="minorEastAsia" w:hAnsi="Calibri" w:cs="Calibri"/>
+          <w:color w:val="FF0000"/>
+          <w:sz w:val="24"/>
+          <w:szCs w:val="24"/>
+        </w:rPr>
+      </w:pPr>
+    </w:p>
+    <w:p>
+      <w:pPr>
+        <w:rPr>
+          <w:rFonts w:ascii="Calibri" w:eastAsiaTheme="minorEastAsia" w:hAnsi="Calibri" w:cs="Calibri"/>
+          <w:color w:val="FF0000"/>
+          <w:sz w:val="24"/>
+          <w:szCs w:val="24"/>
+        </w:rPr>
+      </w:pPr>
+    </w:p>
+    <w:p>
+      <w:pPr>
+        <w:rPr>
+          <w:rFonts w:ascii="Calibri" w:eastAsiaTheme="minorEastAsia" w:hAnsi="Calibri" w:cs="Calibri"/>
+          <w:color w:val="FF0000"/>
+          <w:sz w:val="24"/>
+          <w:szCs w:val="24"/>
+        </w:rPr>
+      </w:pPr>
+    </w:p>
+    <w:p>
+      <w:pPr>
+        <w:rPr>
+          <w:rFonts w:ascii="Calibri" w:eastAsiaTheme="minorEastAsia" w:hAnsi="Calibri" w:cs="Calibri"/>
+          <w:color w:val="FF0000"/>
           <w:sz w:val="24"/>
           <w:szCs w:val="24"/>
         </w:rPr>
@@ -899,7 +697,24 @@
           <w:sz w:val="24"/>
           <w:szCs w:val="24"/>
         </w:rPr>
-        <w:t xml:space="preserve">After comparing the findings from these two races, do you think that your findings about the differences in </w:t>
+        <w:t xml:space="preserve">Now, let’s compare our findings to another women’s world cup giant slalom race at Copper Mountain. The data is stored in Copper_diff.csv. Below are the results from a test for difference in mean run times.  Interpret the results from the test and the 95% CI. </w:t>
+      </w:r>
+    </w:p>
+    <w:p>
+      <w:pPr>
+        <w:rPr>
+          <w:rFonts w:ascii="Calibri" w:eastAsiaTheme="minorEastAsia" w:hAnsi="Calibri" w:cs="Calibri"/>
+          <w:sz w:val="24"/>
+          <w:szCs w:val="24"/>
+        </w:rPr>
+      </w:pPr>
+      <w:r>
+        <w:rPr>
+          <w:rFonts w:ascii="Calibri" w:eastAsiaTheme="minorEastAsia" w:hAnsi="Calibri" w:cs="Calibri"/>
+          <w:sz w:val="24"/>
+          <w:szCs w:val="24"/>
+        </w:rPr>
+        <w:t>95 percent confidence interval: (-0.</w:t>
       </w:r>
       <w:proofErr w:type="gramStart"/>
       <w:r>
@@ -908,7 +723,31 @@
           <w:sz w:val="24"/>
           <w:szCs w:val="24"/>
         </w:rPr>
-        <w:t>run</w:t>
+        <w:t>1</w:t>
+      </w:r>
+      <w:r>
+        <w:rPr>
+          <w:rFonts w:ascii="Calibri" w:eastAsiaTheme="minorEastAsia" w:hAnsi="Calibri" w:cs="Calibri"/>
+          <w:sz w:val="24"/>
+          <w:szCs w:val="24"/>
+        </w:rPr>
+        <w:t>5</w:t>
+      </w:r>
+      <w:r>
+        <w:rPr>
+          <w:rFonts w:ascii="Calibri" w:eastAsiaTheme="minorEastAsia" w:hAnsi="Calibri" w:cs="Calibri"/>
+          <w:sz w:val="24"/>
+          <w:szCs w:val="24"/>
+        </w:rPr>
+        <w:t>,  0.4</w:t>
+      </w:r>
+      <w:r>
+        <w:rPr>
+          <w:rFonts w:ascii="Calibri" w:eastAsiaTheme="minorEastAsia" w:hAnsi="Calibri" w:cs="Calibri"/>
+          <w:sz w:val="24"/>
+          <w:szCs w:val="24"/>
+        </w:rPr>
+        <w:t>1</w:t>
       </w:r>
       <w:proofErr w:type="gramEnd"/>
       <w:r>
@@ -917,49 +756,134 @@
           <w:sz w:val="24"/>
           <w:szCs w:val="24"/>
         </w:rPr>
-        <w:t xml:space="preserve"> times at Mont-Tremblant could be applied to other World Cup GS races? Discuss the limitations of this analysis.</w:t>
-      </w:r>
-    </w:p>
-    <w:p>
-      <w:pPr>
-        <w:rPr>
-          <w:rFonts w:ascii="Calibri" w:eastAsiaTheme="minorEastAsia" w:hAnsi="Calibri" w:cs="Calibri"/>
-          <w:sz w:val="24"/>
-          <w:szCs w:val="24"/>
-        </w:rPr>
-      </w:pPr>
-    </w:p>
-    <w:p>
-      <w:pPr>
-        <w:rPr>
-          <w:rFonts w:ascii="Calibri" w:eastAsiaTheme="minorEastAsia" w:hAnsi="Calibri" w:cs="Calibri"/>
-          <w:sz w:val="24"/>
-          <w:szCs w:val="24"/>
-        </w:rPr>
-      </w:pPr>
-    </w:p>
-    <w:p>
-      <w:pPr>
-        <w:rPr>
-          <w:rFonts w:ascii="Calibri" w:eastAsiaTheme="minorEastAsia" w:hAnsi="Calibri" w:cs="Calibri"/>
-          <w:sz w:val="24"/>
-          <w:szCs w:val="24"/>
-        </w:rPr>
-      </w:pPr>
-    </w:p>
-    <w:p>
-      <w:pPr>
-        <w:rPr>
-          <w:rFonts w:ascii="Calibri" w:eastAsiaTheme="minorEastAsia" w:hAnsi="Calibri" w:cs="Calibri"/>
-          <w:sz w:val="24"/>
-          <w:szCs w:val="24"/>
-        </w:rPr>
-      </w:pPr>
-    </w:p>
-    <w:p>
-      <w:pPr>
-        <w:rPr>
-          <w:rFonts w:ascii="Calibri" w:eastAsiaTheme="minorEastAsia" w:hAnsi="Calibri" w:cs="Calibri"/>
+        <w:t>)</w:t>
+      </w:r>
+    </w:p>
+    <w:p>
+      <w:pPr>
+        <w:rPr>
+          <w:rFonts w:ascii="Calibri" w:eastAsiaTheme="minorEastAsia" w:hAnsi="Calibri" w:cs="Calibri"/>
+          <w:sz w:val="24"/>
+          <w:szCs w:val="24"/>
+        </w:rPr>
+      </w:pPr>
+      <w:r>
+        <w:rPr>
+          <w:rFonts w:ascii="Calibri" w:eastAsiaTheme="minorEastAsia" w:hAnsi="Calibri" w:cs="Calibri"/>
+          <w:sz w:val="24"/>
+          <w:szCs w:val="24"/>
+        </w:rPr>
+        <w:t>Mean Difference = 0.1</w:t>
+      </w:r>
+      <w:r>
+        <w:rPr>
+          <w:rFonts w:ascii="Calibri" w:eastAsiaTheme="minorEastAsia" w:hAnsi="Calibri" w:cs="Calibri"/>
+          <w:sz w:val="24"/>
+          <w:szCs w:val="24"/>
+        </w:rPr>
+        <w:t>3</w:t>
+      </w:r>
+    </w:p>
+    <w:p>
+      <w:pPr>
+        <w:rPr>
+          <w:rFonts w:ascii="Calibri" w:eastAsiaTheme="minorEastAsia" w:hAnsi="Calibri" w:cs="Calibri"/>
+          <w:sz w:val="24"/>
+          <w:szCs w:val="24"/>
+        </w:rPr>
+      </w:pPr>
+      <w:r>
+        <w:rPr>
+          <w:rFonts w:ascii="Calibri" w:eastAsiaTheme="minorEastAsia" w:hAnsi="Calibri" w:cs="Calibri"/>
+          <w:sz w:val="24"/>
+          <w:szCs w:val="24"/>
+        </w:rPr>
+        <w:t xml:space="preserve">t = 0.950, </w:t>
+      </w:r>
+      <w:proofErr w:type="spellStart"/>
+      <w:r>
+        <w:rPr>
+          <w:rFonts w:ascii="Calibri" w:eastAsiaTheme="minorEastAsia" w:hAnsi="Calibri" w:cs="Calibri"/>
+          <w:sz w:val="24"/>
+          <w:szCs w:val="24"/>
+        </w:rPr>
+        <w:t>df</w:t>
+      </w:r>
+      <w:proofErr w:type="spellEnd"/>
+      <w:r>
+        <w:rPr>
+          <w:rFonts w:ascii="Calibri" w:eastAsiaTheme="minorEastAsia" w:hAnsi="Calibri" w:cs="Calibri"/>
+          <w:sz w:val="24"/>
+          <w:szCs w:val="24"/>
+        </w:rPr>
+        <w:t xml:space="preserve"> = 28, p-value = 0.350</w:t>
+      </w:r>
+    </w:p>
+    <w:p>
+      <w:pPr>
+        <w:rPr>
+          <w:rFonts w:ascii="Calibri" w:eastAsiaTheme="minorEastAsia" w:hAnsi="Calibri" w:cs="Calibri"/>
+          <w:color w:val="EE0000"/>
+          <w:sz w:val="24"/>
+          <w:szCs w:val="24"/>
+        </w:rPr>
+      </w:pPr>
+    </w:p>
+    <w:p>
+      <w:pPr>
+        <w:rPr>
+          <w:rFonts w:ascii="Calibri" w:eastAsiaTheme="minorEastAsia" w:hAnsi="Calibri" w:cs="Calibri"/>
+          <w:color w:val="EE0000"/>
+          <w:sz w:val="24"/>
+          <w:szCs w:val="24"/>
+        </w:rPr>
+      </w:pPr>
+    </w:p>
+    <w:p>
+      <w:pPr>
+        <w:rPr>
+          <w:rFonts w:ascii="Calibri" w:eastAsiaTheme="minorEastAsia" w:hAnsi="Calibri" w:cs="Calibri"/>
+          <w:color w:val="EE0000"/>
+          <w:sz w:val="24"/>
+          <w:szCs w:val="24"/>
+        </w:rPr>
+      </w:pPr>
+    </w:p>
+    <w:p>
+      <w:pPr>
+        <w:rPr>
+          <w:rFonts w:ascii="Calibri" w:eastAsiaTheme="minorEastAsia" w:hAnsi="Calibri" w:cs="Calibri"/>
+          <w:color w:val="EE0000"/>
+          <w:sz w:val="24"/>
+          <w:szCs w:val="24"/>
+        </w:rPr>
+      </w:pPr>
+    </w:p>
+    <w:p>
+      <w:pPr>
+        <w:rPr>
+          <w:rFonts w:ascii="Calibri" w:eastAsiaTheme="minorEastAsia" w:hAnsi="Calibri" w:cs="Calibri"/>
+          <w:color w:val="EE0000"/>
+          <w:sz w:val="24"/>
+          <w:szCs w:val="24"/>
+        </w:rPr>
+      </w:pPr>
+    </w:p>
+    <w:p>
+      <w:pPr>
+        <w:rPr>
+          <w:rFonts w:ascii="Calibri" w:eastAsiaTheme="minorEastAsia" w:hAnsi="Calibri" w:cs="Calibri"/>
+          <w:color w:val="EE0000"/>
+          <w:sz w:val="24"/>
+          <w:szCs w:val="24"/>
+        </w:rPr>
+      </w:pPr>
+    </w:p>
+    <w:p>
+      <w:pPr>
+        <w:rPr>
+          <w:rFonts w:ascii="Calibri" w:eastAsiaTheme="minorEastAsia" w:hAnsi="Calibri" w:cs="Calibri"/>
+          <w:color w:val="EE0000"/>
           <w:sz w:val="24"/>
           <w:szCs w:val="24"/>
         </w:rPr>
@@ -993,6 +917,202 @@
           <w:sz w:val="24"/>
           <w:szCs w:val="24"/>
         </w:rPr>
+        <w:t>What do th</w:t>
+      </w:r>
+      <w:r>
+        <w:rPr>
+          <w:rFonts w:ascii="Calibri" w:eastAsiaTheme="minorEastAsia" w:hAnsi="Calibri" w:cs="Calibri"/>
+          <w:sz w:val="24"/>
+          <w:szCs w:val="24"/>
+        </w:rPr>
+        <w:t>e above findings</w:t>
+      </w:r>
+      <w:r>
+        <w:rPr>
+          <w:rFonts w:ascii="Calibri" w:eastAsiaTheme="minorEastAsia" w:hAnsi="Calibri" w:cs="Calibri"/>
+          <w:sz w:val="24"/>
+          <w:szCs w:val="24"/>
+        </w:rPr>
+        <w:t xml:space="preserve"> reveal about the differences between courses on the first and second run</w:t>
+      </w:r>
+      <w:r>
+        <w:rPr>
+          <w:rFonts w:ascii="Calibri" w:eastAsiaTheme="minorEastAsia" w:hAnsi="Calibri" w:cs="Calibri"/>
+          <w:sz w:val="24"/>
+          <w:szCs w:val="24"/>
+        </w:rPr>
+        <w:t xml:space="preserve"> </w:t>
+      </w:r>
+      <w:r>
+        <w:rPr>
+          <w:rFonts w:ascii="Calibri" w:eastAsiaTheme="minorEastAsia" w:hAnsi="Calibri" w:cs="Calibri"/>
+          <w:sz w:val="24"/>
+          <w:szCs w:val="24"/>
+        </w:rPr>
+        <w:t xml:space="preserve">for this race at </w:t>
+      </w:r>
+      <w:proofErr w:type="gramStart"/>
+      <w:r>
+        <w:rPr>
+          <w:rFonts w:ascii="Calibri" w:eastAsiaTheme="minorEastAsia" w:hAnsi="Calibri" w:cs="Calibri"/>
+          <w:sz w:val="24"/>
+          <w:szCs w:val="24"/>
+        </w:rPr>
+        <w:t>Copper</w:t>
+      </w:r>
+      <w:proofErr w:type="gramEnd"/>
+      <w:r>
+        <w:rPr>
+          <w:rFonts w:ascii="Calibri" w:eastAsiaTheme="minorEastAsia" w:hAnsi="Calibri" w:cs="Calibri"/>
+          <w:sz w:val="24"/>
+          <w:szCs w:val="24"/>
+        </w:rPr>
+        <w:t>?</w:t>
+      </w:r>
+    </w:p>
+    <w:p>
+      <w:pPr>
+        <w:rPr>
+          <w:rFonts w:ascii="Calibri" w:hAnsi="Calibri" w:cs="Calibri"/>
+          <w:color w:val="FF0000"/>
+          <w:sz w:val="24"/>
+          <w:szCs w:val="24"/>
+        </w:rPr>
+      </w:pPr>
+    </w:p>
+    <w:p>
+      <w:pPr>
+        <w:rPr>
+          <w:rFonts w:ascii="Calibri" w:hAnsi="Calibri" w:cs="Calibri"/>
+          <w:color w:val="FF0000"/>
+          <w:sz w:val="24"/>
+          <w:szCs w:val="24"/>
+        </w:rPr>
+      </w:pPr>
+    </w:p>
+    <w:p>
+      <w:pPr>
+        <w:rPr>
+          <w:rFonts w:ascii="Calibri" w:eastAsiaTheme="minorEastAsia" w:hAnsi="Calibri" w:cs="Calibri"/>
+          <w:sz w:val="24"/>
+          <w:szCs w:val="24"/>
+        </w:rPr>
+      </w:pPr>
+    </w:p>
+    <w:p>
+      <w:pPr>
+        <w:rPr>
+          <w:rFonts w:ascii="Calibri" w:eastAsiaTheme="minorEastAsia" w:hAnsi="Calibri" w:cs="Calibri"/>
+          <w:sz w:val="24"/>
+          <w:szCs w:val="24"/>
+        </w:rPr>
+      </w:pPr>
+    </w:p>
+    <w:p>
+      <w:pPr>
+        <w:rPr>
+          <w:rFonts w:ascii="Calibri" w:eastAsiaTheme="minorEastAsia" w:hAnsi="Calibri" w:cs="Calibri"/>
+          <w:sz w:val="24"/>
+          <w:szCs w:val="24"/>
+        </w:rPr>
+      </w:pPr>
+    </w:p>
+    <w:p>
+      <w:pPr>
+        <w:pStyle w:val="ListParagraph"/>
+        <w:numPr>
+          <w:ilvl w:val="0"/>
+          <w:numId w:val="2"/>
+        </w:numPr>
+        <w:rPr>
+          <w:rFonts w:ascii="Calibri" w:eastAsiaTheme="minorEastAsia" w:hAnsi="Calibri" w:cs="Calibri"/>
+          <w:sz w:val="24"/>
+          <w:szCs w:val="24"/>
+        </w:rPr>
+      </w:pPr>
+      <w:r>
+        <w:rPr>
+          <w:rFonts w:ascii="Calibri" w:eastAsiaTheme="minorEastAsia" w:hAnsi="Calibri" w:cs="Calibri"/>
+          <w:sz w:val="24"/>
+          <w:szCs w:val="24"/>
+        </w:rPr>
+        <w:lastRenderedPageBreak/>
+        <w:t xml:space="preserve">After comparing the findings from these two races, do you think that your findings about the differences in </w:t>
+      </w:r>
+      <w:proofErr w:type="gramStart"/>
+      <w:r>
+        <w:rPr>
+          <w:rFonts w:ascii="Calibri" w:eastAsiaTheme="minorEastAsia" w:hAnsi="Calibri" w:cs="Calibri"/>
+          <w:sz w:val="24"/>
+          <w:szCs w:val="24"/>
+        </w:rPr>
+        <w:t>run</w:t>
+      </w:r>
+      <w:proofErr w:type="gramEnd"/>
+      <w:r>
+        <w:rPr>
+          <w:rFonts w:ascii="Calibri" w:eastAsiaTheme="minorEastAsia" w:hAnsi="Calibri" w:cs="Calibri"/>
+          <w:sz w:val="24"/>
+          <w:szCs w:val="24"/>
+        </w:rPr>
+        <w:t xml:space="preserve"> times at Mont-Tremblant could be applied to other World Cup GS races? Discuss the limitations of this analysis.</w:t>
+      </w:r>
+    </w:p>
+    <w:p>
+      <w:pPr>
+        <w:rPr>
+          <w:rFonts w:ascii="Calibri" w:eastAsiaTheme="minorEastAsia" w:hAnsi="Calibri" w:cs="Calibri"/>
+          <w:sz w:val="24"/>
+          <w:szCs w:val="24"/>
+        </w:rPr>
+      </w:pPr>
+    </w:p>
+    <w:p>
+      <w:pPr>
+        <w:rPr>
+          <w:rFonts w:ascii="Calibri" w:eastAsiaTheme="minorEastAsia" w:hAnsi="Calibri" w:cs="Calibri"/>
+          <w:sz w:val="24"/>
+          <w:szCs w:val="24"/>
+        </w:rPr>
+      </w:pPr>
+    </w:p>
+    <w:p>
+      <w:pPr>
+        <w:rPr>
+          <w:rFonts w:ascii="Calibri" w:eastAsiaTheme="minorEastAsia" w:hAnsi="Calibri" w:cs="Calibri"/>
+          <w:sz w:val="24"/>
+          <w:szCs w:val="24"/>
+        </w:rPr>
+      </w:pPr>
+    </w:p>
+    <w:p>
+      <w:pPr>
+        <w:rPr>
+          <w:rFonts w:ascii="Calibri" w:eastAsiaTheme="minorEastAsia" w:hAnsi="Calibri" w:cs="Calibri"/>
+          <w:sz w:val="24"/>
+          <w:szCs w:val="24"/>
+        </w:rPr>
+      </w:pPr>
+    </w:p>
+    <w:p>
+      <w:pPr>
+        <w:pStyle w:val="ListParagraph"/>
+        <w:numPr>
+          <w:ilvl w:val="0"/>
+          <w:numId w:val="2"/>
+        </w:numPr>
+        <w:rPr>
+          <w:rFonts w:ascii="Calibri" w:eastAsiaTheme="minorEastAsia" w:hAnsi="Calibri" w:cs="Calibri"/>
+          <w:sz w:val="24"/>
+          <w:szCs w:val="24"/>
+        </w:rPr>
+      </w:pPr>
+      <w:r>
+        <w:rPr>
+          <w:rFonts w:ascii="Calibri" w:eastAsiaTheme="minorEastAsia" w:hAnsi="Calibri" w:cs="Calibri"/>
+          <w:sz w:val="24"/>
+          <w:szCs w:val="24"/>
+        </w:rPr>
         <w:t xml:space="preserve">Let’s suppose that race officials would like the difficulty of the two courses </w:t>
       </w:r>
       <w:proofErr w:type="gramStart"/>
@@ -1013,6 +1133,23 @@
         </w:rPr>
         <w:t xml:space="preserve"> race to be roughly the same. Which race (Mont Tremblant or Copper) would you say meets this goal and why?</w:t>
       </w:r>
+    </w:p>
+    <w:p>
+      <w:pPr>
+        <w:rPr>
+          <w:rFonts w:ascii="Calibri" w:hAnsi="Calibri" w:cs="Calibri"/>
+          <w:sz w:val="24"/>
+          <w:szCs w:val="24"/>
+        </w:rPr>
+      </w:pPr>
+    </w:p>
+    <w:p>
+      <w:pPr>
+        <w:rPr>
+          <w:rFonts w:ascii="Calibri" w:hAnsi="Calibri" w:cs="Calibri"/>
+          <w:color w:val="FF0000"/>
+        </w:rPr>
+      </w:pPr>
     </w:p>
     <w:p>
       <w:pPr>

</xml_diff>